<commit_message>
Sync public subset from course_master (69465aa)
</commit_message>
<xml_diff>
--- a/3_Pilot_Course/participant_bundles/Course_Master_FILL_IN.docx
+++ b/3_Pilot_Course/participant_bundles/Course_Master_FILL_IN.docx
@@ -4832,13 +4832,22 @@
     <w:bookmarkEnd w:id="48"/>
     <w:bookmarkEnd w:id="49"/>
     <w:bookmarkEnd w:id="50"/>
-    <w:bookmarkStart w:id="51" w:name="week-3-build-your-module"/>
+    <w:bookmarkStart w:id="56" w:name="week-3-module-skeleton-map"/>
     <w:p>
       <w:pPr>
         <w:pStyle w:val="Heading1"/>
       </w:pPr>
       <w:r>
-        <w:t xml:space="preserve">Week 3 — Build Your Module</w:t>
+        <w:t xml:space="preserve">Week 3 — Module Skeleton Map</w:t>
+      </w:r>
+    </w:p>
+    <w:bookmarkStart w:id="51" w:name="module-skeleton-map-template"/>
+    <w:p>
+      <w:pPr>
+        <w:pStyle w:val="Heading2"/>
+      </w:pPr>
+      <w:r>
+        <w:t xml:space="preserve">Module Skeleton Map — TEMPLATE</w:t>
       </w:r>
     </w:p>
     <w:p>
@@ -4846,7 +4855,26 @@
         <w:pStyle w:val="FirstParagraph"/>
       </w:pPr>
       <w:r>
-        <w:t xml:space="preserve">Module Build Template</w:t>
+        <w:rPr>
+          <w:i/>
+          <w:iCs/>
+        </w:rPr>
+        <w:t xml:space="preserve">Guide §5. One page per module, filled in Week 3, before anything is produced. Your MDD row says what the module contains; this map says what each piece becomes and where it lives. Model: the coffee course’s Module 1 folder (</w:t>
+      </w:r>
+      <w:r>
+        <w:rPr>
+          <w:rStyle w:val="VerbatimChar"/>
+          <w:i/>
+          <w:iCs/>
+        </w:rPr>
+        <w:t xml:space="preserve">Coffee_Module1_filled.zip</w:t>
+      </w:r>
+      <w:r>
+        <w:rPr>
+          <w:i/>
+          <w:iCs/>
+        </w:rPr>
+        <w:t xml:space="preserve">) — every file named, three built to depth. Parts A–B start in class; C–D are the deep work, at your desk.</w:t>
       </w:r>
     </w:p>
     <w:p>
@@ -4854,9 +4882,1520 @@
         <w:pStyle w:val="BodyText"/>
       </w:pPr>
       <w:r>
-        <w:t xml:space="preserve">Each item below represents various module pages</w:t>
-      </w:r>
-    </w:p>
+        <w:rPr>
+          <w:b/>
+          <w:bCs/>
+        </w:rPr>
+        <w:t xml:space="preserve">Module:</w:t>
+      </w:r>
+      <w:r>
+        <w:t xml:space="preserve"> </w:t>
+      </w:r>
+      <w:r>
+        <w:t xml:space="preserve">[number and title]</w:t>
+      </w:r>
+      <w:r>
+        <w:t xml:space="preserve"> </w:t>
+      </w:r>
+      <w:r>
+        <w:rPr>
+          <w:b/>
+          <w:bCs/>
+        </w:rPr>
+        <w:t xml:space="preserve">Container slot:</w:t>
+      </w:r>
+      <w:r>
+        <w:t xml:space="preserve"> </w:t>
+      </w:r>
+      <w:r>
+        <w:t xml:space="preserve">[e.g. one 90-minute session]</w:t>
+      </w:r>
+      <w:r>
+        <w:t xml:space="preserve"> </w:t>
+      </w:r>
+      <w:r>
+        <w:rPr>
+          <w:b/>
+          <w:bCs/>
+        </w:rPr>
+        <w:t xml:space="preserve">Who teaches it:</w:t>
+      </w:r>
+      <w:r>
+        <w:t xml:space="preserve"> </w:t>
+      </w:r>
+      <w:r>
+        <w:t xml:space="preserve">[only me → floor · others → gold where needed]</w:t>
+      </w:r>
+    </w:p>
+    <w:bookmarkEnd w:id="51"/>
+    <w:bookmarkStart w:id="52" w:name="a.-from-the-mdd-row"/>
+    <w:p>
+      <w:pPr>
+        <w:pStyle w:val="Heading2"/>
+      </w:pPr>
+      <w:r>
+        <w:t xml:space="preserve">A. From the MDD row</w:t>
+      </w:r>
+    </w:p>
+    <w:tbl>
+      <w:tblPr>
+        <w:tblStyle w:val="Table"/>
+        <w:tblW w:type="pct" w:w="5000"/>
+        <w:tblLayout w:type="fixed"/>
+        <w:tblLook w:firstRow="1" w:lastRow="0" w:firstColumn="0" w:lastColumn="0" w:noHBand="0" w:noVBand="0" w:val="0020"/>
+      </w:tblPr>
+      <w:tblGrid>
+        <w:gridCol w:w="1584"/>
+        <w:gridCol w:w="1584"/>
+        <w:gridCol w:w="1584"/>
+        <w:gridCol w:w="1584"/>
+        <w:gridCol w:w="1584"/>
+      </w:tblGrid>
+      <w:tr>
+        <w:trPr>
+          <w:tblHeader w:val="on"/>
+        </w:trPr>
+        <w:tc>
+          <w:tcPr/>
+          <w:p>
+            <w:pPr>
+              <w:pStyle w:val="Compact"/>
+            </w:pPr>
+            <w:r>
+              <w:t xml:space="preserve">Module objectives (→CO#)</w:t>
+            </w:r>
+          </w:p>
+        </w:tc>
+        <w:tc>
+          <w:tcPr/>
+          <w:p>
+            <w:pPr>
+              <w:pStyle w:val="Compact"/>
+            </w:pPr>
+            <w:r>
+              <w:t xml:space="preserve">Evidence it builds toward</w:t>
+            </w:r>
+          </w:p>
+        </w:tc>
+        <w:tc>
+          <w:tcPr/>
+          <w:p>
+            <w:pPr>
+              <w:pStyle w:val="Compact"/>
+            </w:pPr>
+            <w:r>
+              <w:t xml:space="preserve">Named activities</w:t>
+            </w:r>
+          </w:p>
+        </w:tc>
+        <w:tc>
+          <w:tcPr/>
+          <w:p>
+            <w:pPr>
+              <w:pStyle w:val="Compact"/>
+            </w:pPr>
+            <w:r>
+              <w:t xml:space="preserve">Materials to build (</w:t>
+            </w:r>
+            <w:r>
+              <w:rPr>
+                <w:rStyle w:val="VerbatimChar"/>
+              </w:rPr>
+              <w:t xml:space="preserve">&lt;Created&gt;</w:t>
+            </w:r>
+            <w:r>
+              <w:t xml:space="preserve">)</w:t>
+            </w:r>
+          </w:p>
+        </w:tc>
+        <w:tc>
+          <w:tcPr/>
+          <w:p>
+            <w:pPr>
+              <w:pStyle w:val="Compact"/>
+            </w:pPr>
+            <w:r>
+              <w:t xml:space="preserve">Curated media</w:t>
+            </w:r>
+          </w:p>
+        </w:tc>
+      </w:tr>
+      <w:tr>
+        <w:tc>
+          <w:tcPr/>
+          <w:p>
+            <w:pPr>
+              <w:pStyle w:val="Compact"/>
+            </w:pPr>
+          </w:p>
+        </w:tc>
+        <w:tc>
+          <w:tcPr/>
+          <w:p>
+            <w:pPr>
+              <w:pStyle w:val="Compact"/>
+            </w:pPr>
+          </w:p>
+        </w:tc>
+        <w:tc>
+          <w:tcPr/>
+          <w:p>
+            <w:pPr>
+              <w:pStyle w:val="Compact"/>
+            </w:pPr>
+          </w:p>
+        </w:tc>
+        <w:tc>
+          <w:tcPr/>
+          <w:p>
+            <w:pPr>
+              <w:pStyle w:val="Compact"/>
+            </w:pPr>
+          </w:p>
+        </w:tc>
+        <w:tc>
+          <w:tcPr/>
+          <w:p>
+            <w:pPr>
+              <w:pStyle w:val="Compact"/>
+            </w:pPr>
+          </w:p>
+        </w:tc>
+      </w:tr>
+    </w:tbl>
+    <w:bookmarkEnd w:id="52"/>
+    <w:bookmarkStart w:id="53" w:name="b.-the-file-map-generic-role-your-file"/>
+    <w:p>
+      <w:pPr>
+        <w:pStyle w:val="Heading2"/>
+      </w:pPr>
+      <w:r>
+        <w:t xml:space="preserve">B. The file map — generic role → your file</w:t>
+      </w:r>
+    </w:p>
+    <w:p>
+      <w:pPr>
+        <w:pStyle w:val="FirstParagraph"/>
+      </w:pPr>
+      <w:r>
+        <w:t xml:space="preserve">Unzip</w:t>
+      </w:r>
+      <w:r>
+        <w:t xml:space="preserve"> </w:t>
+      </w:r>
+      <w:r>
+        <w:rPr>
+          <w:rStyle w:val="VerbatimChar"/>
+        </w:rPr>
+        <w:t xml:space="preserve">Module_Skeleton_TEMPLATE.zip</w:t>
+      </w:r>
+      <w:r>
+        <w:t xml:space="preserve"> </w:t>
+      </w:r>
+      <w:r>
+        <w:t xml:space="preserve">inside your course folder; it holds every role below as a one-line placeholder. Name each file in your own form, or cross the row out.</w:t>
+      </w:r>
+      <w:r>
+        <w:t xml:space="preserve"> </w:t>
+      </w:r>
+      <w:r>
+        <w:rPr>
+          <w:b/>
+          <w:bCs/>
+        </w:rPr>
+        <w:t xml:space="preserve">The list is a recommended default, not a checklist</w:t>
+      </w:r>
+      <w:r>
+        <w:t xml:space="preserve"> </w:t>
+      </w:r>
+      <w:r>
+        <w:t xml:space="preserve">— a 90-minute workshop uses far fewer than an eight-week course.</w:t>
+      </w:r>
+    </w:p>
+    <w:tbl>
+      <w:tblPr>
+        <w:tblStyle w:val="Table"/>
+        <w:tblW w:type="pct" w:w="5000"/>
+        <w:tblLayout w:type="fixed"/>
+        <w:tblLook w:firstRow="1" w:lastRow="0" w:firstColumn="0" w:lastColumn="0" w:noHBand="0" w:noVBand="0" w:val="0020"/>
+      </w:tblPr>
+      <w:tblGrid>
+        <w:gridCol w:w="1980"/>
+        <w:gridCol w:w="1980"/>
+        <w:gridCol w:w="1980"/>
+        <w:gridCol w:w="1980"/>
+      </w:tblGrid>
+      <w:tr>
+        <w:trPr>
+          <w:tblHeader w:val="on"/>
+        </w:trPr>
+        <w:tc>
+          <w:tcPr/>
+          <w:p>
+            <w:pPr>
+              <w:pStyle w:val="Compact"/>
+            </w:pPr>
+            <w:r>
+              <w:t xml:space="preserve">Package</w:t>
+            </w:r>
+          </w:p>
+        </w:tc>
+        <w:tc>
+          <w:tcPr/>
+          <w:p>
+            <w:pPr>
+              <w:pStyle w:val="Compact"/>
+            </w:pPr>
+            <w:r>
+              <w:t xml:space="preserve">Generic role (the template’s name)</w:t>
+            </w:r>
+          </w:p>
+        </w:tc>
+        <w:tc>
+          <w:tcPr/>
+          <w:p>
+            <w:pPr>
+              <w:pStyle w:val="Compact"/>
+            </w:pPr>
+            <w:r>
+              <w:t xml:space="preserve">Your file — its form in your medium</w:t>
+            </w:r>
+          </w:p>
+        </w:tc>
+        <w:tc>
+          <w:tcPr/>
+          <w:p>
+            <w:pPr>
+              <w:pStyle w:val="Compact"/>
+            </w:pPr>
+            <w:r>
+              <w:t xml:space="preserve">Built from</w:t>
+            </w:r>
+          </w:p>
+        </w:tc>
+      </w:tr>
+      <w:tr>
+        <w:tc>
+          <w:tcPr/>
+          <w:p>
+            <w:pPr>
+              <w:pStyle w:val="Compact"/>
+            </w:pPr>
+            <w:r>
+              <w:t xml:space="preserve">Instructor</w:t>
+            </w:r>
+          </w:p>
+        </w:tc>
+        <w:tc>
+          <w:tcPr/>
+          <w:p>
+            <w:pPr>
+              <w:pStyle w:val="Compact"/>
+            </w:pPr>
+            <w:r>
+              <w:rPr>
+                <w:rStyle w:val="VerbatimChar"/>
+              </w:rPr>
+              <w:t xml:space="preserve">deep_dives/background</w:t>
+            </w:r>
+            <w:r>
+              <w:t xml:space="preserve"> </w:t>
+            </w:r>
+            <w:r>
+              <w:t xml:space="preserve">— know more than you teach</w:t>
+            </w:r>
+          </w:p>
+        </w:tc>
+        <w:tc>
+          <w:tcPr/>
+          <w:p>
+            <w:pPr>
+              <w:pStyle w:val="Compact"/>
+            </w:pPr>
+          </w:p>
+        </w:tc>
+        <w:tc>
+          <w:tcPr/>
+          <w:p>
+            <w:pPr>
+              <w:pStyle w:val="Compact"/>
+            </w:pPr>
+          </w:p>
+        </w:tc>
+      </w:tr>
+      <w:tr>
+        <w:tc>
+          <w:tcPr/>
+          <w:p>
+            <w:pPr>
+              <w:pStyle w:val="Compact"/>
+            </w:pPr>
+            <w:r>
+              <w:t xml:space="preserve">Instructor</w:t>
+            </w:r>
+          </w:p>
+        </w:tc>
+        <w:tc>
+          <w:tcPr/>
+          <w:p>
+            <w:pPr>
+              <w:pStyle w:val="Compact"/>
+            </w:pPr>
+            <w:r>
+              <w:rPr>
+                <w:rStyle w:val="VerbatimChar"/>
+              </w:rPr>
+              <w:t xml:space="preserve">reference_solution/complete_solution</w:t>
+            </w:r>
+            <w:r>
+              <w:t xml:space="preserve"> </w:t>
+            </w:r>
+            <w:r>
+              <w:t xml:space="preserve">— the complete version</w:t>
+            </w:r>
+          </w:p>
+        </w:tc>
+        <w:tc>
+          <w:tcPr/>
+          <w:p>
+            <w:pPr>
+              <w:pStyle w:val="Compact"/>
+            </w:pPr>
+          </w:p>
+        </w:tc>
+        <w:tc>
+          <w:tcPr/>
+          <w:p>
+            <w:pPr>
+              <w:pStyle w:val="Compact"/>
+            </w:pPr>
+            <w:r>
+              <w:t xml:space="preserve">the module’s evidence</w:t>
+            </w:r>
+          </w:p>
+        </w:tc>
+      </w:tr>
+      <w:tr>
+        <w:tc>
+          <w:tcPr/>
+          <w:p>
+            <w:pPr>
+              <w:pStyle w:val="Compact"/>
+            </w:pPr>
+            <w:r>
+              <w:t xml:space="preserve">Instructor</w:t>
+            </w:r>
+          </w:p>
+        </w:tc>
+        <w:tc>
+          <w:tcPr/>
+          <w:p>
+            <w:pPr>
+              <w:pStyle w:val="Compact"/>
+            </w:pPr>
+            <w:r>
+              <w:rPr>
+                <w:rStyle w:val="VerbatimChar"/>
+              </w:rPr>
+              <w:t xml:space="preserve">reference_solution/solutions_and_key</w:t>
+            </w:r>
+          </w:p>
+        </w:tc>
+        <w:tc>
+          <w:tcPr/>
+          <w:p>
+            <w:pPr>
+              <w:pStyle w:val="Compact"/>
+            </w:pPr>
+          </w:p>
+        </w:tc>
+        <w:tc>
+          <w:tcPr/>
+          <w:p>
+            <w:pPr>
+              <w:pStyle w:val="Compact"/>
+            </w:pPr>
+            <w:r>
+              <w:t xml:space="preserve">the complete version</w:t>
+            </w:r>
+          </w:p>
+        </w:tc>
+      </w:tr>
+      <w:tr>
+        <w:tc>
+          <w:tcPr/>
+          <w:p>
+            <w:pPr>
+              <w:pStyle w:val="Compact"/>
+            </w:pPr>
+            <w:r>
+              <w:t xml:space="preserve">Instructor</w:t>
+            </w:r>
+          </w:p>
+        </w:tc>
+        <w:tc>
+          <w:tcPr/>
+          <w:p>
+            <w:pPr>
+              <w:pStyle w:val="Compact"/>
+            </w:pPr>
+            <w:r>
+              <w:rPr>
+                <w:rStyle w:val="VerbatimChar"/>
+              </w:rPr>
+              <w:t xml:space="preserve">self_check</w:t>
+            </w:r>
+            <w:r>
+              <w:t xml:space="preserve"> </w:t>
+            </w:r>
+            <w:r>
+              <w:t xml:space="preserve">— pass it yourself first</w:t>
+            </w:r>
+          </w:p>
+        </w:tc>
+        <w:tc>
+          <w:tcPr/>
+          <w:p>
+            <w:pPr>
+              <w:pStyle w:val="Compact"/>
+            </w:pPr>
+          </w:p>
+        </w:tc>
+        <w:tc>
+          <w:tcPr/>
+          <w:p>
+            <w:pPr>
+              <w:pStyle w:val="Compact"/>
+            </w:pPr>
+          </w:p>
+        </w:tc>
+      </w:tr>
+      <w:tr>
+        <w:tc>
+          <w:tcPr/>
+          <w:p>
+            <w:pPr>
+              <w:pStyle w:val="Compact"/>
+            </w:pPr>
+            <w:r>
+              <w:t xml:space="preserve">Instructor</w:t>
+            </w:r>
+          </w:p>
+        </w:tc>
+        <w:tc>
+          <w:tcPr/>
+          <w:p>
+            <w:pPr>
+              <w:pStyle w:val="Compact"/>
+            </w:pPr>
+            <w:r>
+              <w:rPr>
+                <w:rStyle w:val="VerbatimChar"/>
+              </w:rPr>
+              <w:t xml:space="preserve">quick_start/</w:t>
+            </w:r>
+            <w:r>
+              <w:t xml:space="preserve"> </w:t>
+            </w:r>
+            <w:r>
+              <w:t xml:space="preserve">— setup · pre/post-class emails · teaching-day checklist · files by segment</w:t>
+            </w:r>
+          </w:p>
+        </w:tc>
+        <w:tc>
+          <w:tcPr/>
+          <w:p>
+            <w:pPr>
+              <w:pStyle w:val="Compact"/>
+            </w:pPr>
+          </w:p>
+        </w:tc>
+        <w:tc>
+          <w:tcPr/>
+          <w:p>
+            <w:pPr>
+              <w:pStyle w:val="Compact"/>
+            </w:pPr>
+          </w:p>
+        </w:tc>
+      </w:tr>
+      <w:tr>
+        <w:tc>
+          <w:tcPr/>
+          <w:p>
+            <w:pPr>
+              <w:pStyle w:val="Compact"/>
+            </w:pPr>
+            <w:r>
+              <w:t xml:space="preserve">Student · pre-class</w:t>
+            </w:r>
+          </w:p>
+        </w:tc>
+        <w:tc>
+          <w:tcPr/>
+          <w:p>
+            <w:pPr>
+              <w:pStyle w:val="Compact"/>
+            </w:pPr>
+            <w:r>
+              <w:rPr>
+                <w:rStyle w:val="VerbatimChar"/>
+              </w:rPr>
+              <w:t xml:space="preserve">pre_class/data/</w:t>
+            </w:r>
+            <w:r>
+              <w:t xml:space="preserve"> </w:t>
+            </w:r>
+            <w:r>
+              <w:t xml:space="preserve">— what nothing runs without</w:t>
+            </w:r>
+          </w:p>
+        </w:tc>
+        <w:tc>
+          <w:tcPr/>
+          <w:p>
+            <w:pPr>
+              <w:pStyle w:val="Compact"/>
+            </w:pPr>
+          </w:p>
+        </w:tc>
+        <w:tc>
+          <w:tcPr/>
+          <w:p>
+            <w:pPr>
+              <w:pStyle w:val="Compact"/>
+            </w:pPr>
+          </w:p>
+        </w:tc>
+      </w:tr>
+      <w:tr>
+        <w:tc>
+          <w:tcPr/>
+          <w:p>
+            <w:pPr>
+              <w:pStyle w:val="Compact"/>
+            </w:pPr>
+            <w:r>
+              <w:t xml:space="preserve">Student · pre-class</w:t>
+            </w:r>
+          </w:p>
+        </w:tc>
+        <w:tc>
+          <w:tcPr/>
+          <w:p>
+            <w:pPr>
+              <w:pStyle w:val="Compact"/>
+            </w:pPr>
+            <w:r>
+              <w:rPr>
+                <w:rStyle w:val="VerbatimChar"/>
+              </w:rPr>
+              <w:t xml:space="preserve">pre_class/study_guide</w:t>
+            </w:r>
+            <w:r>
+              <w:t xml:space="preserve"> </w:t>
+            </w:r>
+            <w:r>
+              <w:t xml:space="preserve">+</w:t>
+            </w:r>
+            <w:r>
+              <w:t xml:space="preserve"> </w:t>
+            </w:r>
+            <w:r>
+              <w:rPr>
+                <w:rStyle w:val="VerbatimChar"/>
+              </w:rPr>
+              <w:t xml:space="preserve">warm_up</w:t>
+            </w:r>
+          </w:p>
+        </w:tc>
+        <w:tc>
+          <w:tcPr/>
+          <w:p>
+            <w:pPr>
+              <w:pStyle w:val="Compact"/>
+            </w:pPr>
+          </w:p>
+        </w:tc>
+        <w:tc>
+          <w:tcPr/>
+          <w:p>
+            <w:pPr>
+              <w:pStyle w:val="Compact"/>
+            </w:pPr>
+            <w:r>
+              <w:t xml:space="preserve">curated media; the Activate / Motivate features</w:t>
+            </w:r>
+          </w:p>
+        </w:tc>
+      </w:tr>
+      <w:tr>
+        <w:tc>
+          <w:tcPr/>
+          <w:p>
+            <w:pPr>
+              <w:pStyle w:val="Compact"/>
+            </w:pPr>
+            <w:r>
+              <w:t xml:space="preserve">Student · live</w:t>
+            </w:r>
+          </w:p>
+        </w:tc>
+        <w:tc>
+          <w:tcPr/>
+          <w:p>
+            <w:pPr>
+              <w:pStyle w:val="Compact"/>
+            </w:pPr>
+            <w:r>
+              <w:rPr>
+                <w:rStyle w:val="VerbatimChar"/>
+              </w:rPr>
+              <w:t xml:space="preserve">live_session/follow_along</w:t>
+            </w:r>
+            <w:r>
+              <w:t xml:space="preserve"> </w:t>
+            </w:r>
+            <w:r>
+              <w:t xml:space="preserve">— complete; students run it along with you</w:t>
+            </w:r>
+          </w:p>
+        </w:tc>
+        <w:tc>
+          <w:tcPr/>
+          <w:p>
+            <w:pPr>
+              <w:pStyle w:val="Compact"/>
+            </w:pPr>
+          </w:p>
+        </w:tc>
+        <w:tc>
+          <w:tcPr/>
+          <w:p>
+            <w:pPr>
+              <w:pStyle w:val="Compact"/>
+            </w:pPr>
+            <w:r>
+              <w:t xml:space="preserve">the complete version</w:t>
+            </w:r>
+          </w:p>
+        </w:tc>
+      </w:tr>
+      <w:tr>
+        <w:tc>
+          <w:tcPr/>
+          <w:p>
+            <w:pPr>
+              <w:pStyle w:val="Compact"/>
+            </w:pPr>
+            <w:r>
+              <w:t xml:space="preserve">Student · live</w:t>
+            </w:r>
+          </w:p>
+        </w:tc>
+        <w:tc>
+          <w:tcPr/>
+          <w:p>
+            <w:pPr>
+              <w:pStyle w:val="Compact"/>
+            </w:pPr>
+            <w:r>
+              <w:rPr>
+                <w:rStyle w:val="VerbatimChar"/>
+              </w:rPr>
+              <w:t xml:space="preserve">live_session/practice_fillin</w:t>
+            </w:r>
+            <w:r>
+              <w:t xml:space="preserve"> </w:t>
+            </w:r>
+            <w:r>
+              <w:t xml:space="preserve">— the we-do</w:t>
+            </w:r>
+          </w:p>
+        </w:tc>
+        <w:tc>
+          <w:tcPr/>
+          <w:p>
+            <w:pPr>
+              <w:pStyle w:val="Compact"/>
+            </w:pPr>
+          </w:p>
+        </w:tc>
+        <w:tc>
+          <w:tcPr/>
+          <w:p>
+            <w:pPr>
+              <w:pStyle w:val="Compact"/>
+            </w:pPr>
+            <w:r>
+              <w:t xml:space="preserve">the complete version, decisions removed</w:t>
+            </w:r>
+          </w:p>
+        </w:tc>
+      </w:tr>
+      <w:tr>
+        <w:tc>
+          <w:tcPr/>
+          <w:p>
+            <w:pPr>
+              <w:pStyle w:val="Compact"/>
+            </w:pPr>
+            <w:r>
+              <w:t xml:space="preserve">Student · live</w:t>
+            </w:r>
+          </w:p>
+        </w:tc>
+        <w:tc>
+          <w:tcPr/>
+          <w:p>
+            <w:pPr>
+              <w:pStyle w:val="Compact"/>
+            </w:pPr>
+            <w:r>
+              <w:rPr>
+                <w:rStyle w:val="VerbatimChar"/>
+              </w:rPr>
+              <w:t xml:space="preserve">live_session/cheat_sheet</w:t>
+            </w:r>
+            <w:r>
+              <w:t xml:space="preserve"> </w:t>
+            </w:r>
+            <w:r>
+              <w:t xml:space="preserve">+</w:t>
+            </w:r>
+            <w:r>
+              <w:t xml:space="preserve"> </w:t>
+            </w:r>
+            <w:r>
+              <w:rPr>
+                <w:rStyle w:val="VerbatimChar"/>
+              </w:rPr>
+              <w:t xml:space="preserve">glossary</w:t>
+            </w:r>
+          </w:p>
+        </w:tc>
+        <w:tc>
+          <w:tcPr/>
+          <w:p>
+            <w:pPr>
+              <w:pStyle w:val="Compact"/>
+            </w:pPr>
+          </w:p>
+        </w:tc>
+        <w:tc>
+          <w:tcPr/>
+          <w:p>
+            <w:pPr>
+              <w:pStyle w:val="Compact"/>
+            </w:pPr>
+            <w:r>
+              <w:t xml:space="preserve">the Organize Knowledge feature</w:t>
+            </w:r>
+          </w:p>
+        </w:tc>
+      </w:tr>
+      <w:tr>
+        <w:tc>
+          <w:tcPr/>
+          <w:p>
+            <w:pPr>
+              <w:pStyle w:val="Compact"/>
+            </w:pPr>
+            <w:r>
+              <w:t xml:space="preserve">Student · guided</w:t>
+            </w:r>
+          </w:p>
+        </w:tc>
+        <w:tc>
+          <w:tcPr/>
+          <w:p>
+            <w:pPr>
+              <w:pStyle w:val="Compact"/>
+            </w:pPr>
+            <w:r>
+              <w:rPr>
+                <w:rStyle w:val="VerbatimChar"/>
+              </w:rPr>
+              <w:t xml:space="preserve">guided_practice/guided_walkthrough</w:t>
+            </w:r>
+            <w:r>
+              <w:t xml:space="preserve"> </w:t>
+            </w:r>
+            <w:r>
+              <w:t xml:space="preserve">+</w:t>
+            </w:r>
+            <w:r>
+              <w:t xml:space="preserve"> </w:t>
+            </w:r>
+            <w:r>
+              <w:rPr>
+                <w:rStyle w:val="VerbatimChar"/>
+              </w:rPr>
+              <w:t xml:space="preserve">self_assessment</w:t>
+            </w:r>
+          </w:p>
+        </w:tc>
+        <w:tc>
+          <w:tcPr/>
+          <w:p>
+            <w:pPr>
+              <w:pStyle w:val="Compact"/>
+            </w:pPr>
+          </w:p>
+        </w:tc>
+        <w:tc>
+          <w:tcPr/>
+          <w:p>
+            <w:pPr>
+              <w:pStyle w:val="Compact"/>
+            </w:pPr>
+          </w:p>
+        </w:tc>
+      </w:tr>
+      <w:tr>
+        <w:tc>
+          <w:tcPr/>
+          <w:p>
+            <w:pPr>
+              <w:pStyle w:val="Compact"/>
+            </w:pPr>
+            <w:r>
+              <w:t xml:space="preserve">Student · post</w:t>
+            </w:r>
+          </w:p>
+        </w:tc>
+        <w:tc>
+          <w:tcPr/>
+          <w:p>
+            <w:pPr>
+              <w:pStyle w:val="Compact"/>
+            </w:pPr>
+            <w:r>
+              <w:rPr>
+                <w:rStyle w:val="VerbatimChar"/>
+              </w:rPr>
+              <w:t xml:space="preserve">post_class/practice</w:t>
+            </w:r>
+            <w:r>
+              <w:t xml:space="preserve"> </w:t>
+            </w:r>
+            <w:r>
+              <w:t xml:space="preserve">+</w:t>
+            </w:r>
+            <w:r>
+              <w:t xml:space="preserve"> </w:t>
+            </w:r>
+            <w:r>
+              <w:rPr>
+                <w:rStyle w:val="VerbatimChar"/>
+              </w:rPr>
+              <w:t xml:space="preserve">quiz</w:t>
+            </w:r>
+          </w:p>
+        </w:tc>
+        <w:tc>
+          <w:tcPr/>
+          <w:p>
+            <w:pPr>
+              <w:pStyle w:val="Compact"/>
+            </w:pPr>
+          </w:p>
+        </w:tc>
+        <w:tc>
+          <w:tcPr/>
+          <w:p>
+            <w:pPr>
+              <w:pStyle w:val="Compact"/>
+            </w:pPr>
+            <w:r>
+              <w:t xml:space="preserve">the Self-Directed feature; the key</w:t>
+            </w:r>
+          </w:p>
+        </w:tc>
+      </w:tr>
+      <w:tr>
+        <w:tc>
+          <w:tcPr/>
+          <w:p>
+            <w:pPr>
+              <w:pStyle w:val="Compact"/>
+            </w:pPr>
+            <w:r>
+              <w:t xml:space="preserve">Teaching Guide</w:t>
+            </w:r>
+          </w:p>
+        </w:tc>
+        <w:tc>
+          <w:tcPr/>
+          <w:p>
+            <w:pPr>
+              <w:pStyle w:val="Compact"/>
+            </w:pPr>
+            <w:r>
+              <w:rPr>
+                <w:rStyle w:val="VerbatimChar"/>
+              </w:rPr>
+              <w:t xml:space="preserve">Teaching_Guide/minute_by_minute</w:t>
+            </w:r>
+            <w:r>
+              <w:t xml:space="preserve"> </w:t>
+            </w:r>
+            <w:r>
+              <w:t xml:space="preserve">— the agenda (part D)</w:t>
+            </w:r>
+          </w:p>
+        </w:tc>
+        <w:tc>
+          <w:tcPr/>
+          <w:p>
+            <w:pPr>
+              <w:pStyle w:val="Compact"/>
+            </w:pPr>
+          </w:p>
+        </w:tc>
+        <w:tc>
+          <w:tcPr/>
+          <w:p>
+            <w:pPr>
+              <w:pStyle w:val="Compact"/>
+            </w:pPr>
+          </w:p>
+        </w:tc>
+      </w:tr>
+      <w:tr>
+        <w:tc>
+          <w:tcPr/>
+          <w:p>
+            <w:pPr>
+              <w:pStyle w:val="Compact"/>
+            </w:pPr>
+            <w:r>
+              <w:t xml:space="preserve">Teaching Guide</w:t>
+            </w:r>
+          </w:p>
+        </w:tc>
+        <w:tc>
+          <w:tcPr/>
+          <w:p>
+            <w:pPr>
+              <w:pStyle w:val="Compact"/>
+            </w:pPr>
+            <w:r>
+              <w:rPr>
+                <w:rStyle w:val="VerbatimChar"/>
+              </w:rPr>
+              <w:t xml:space="preserve">Teaching_Guide/segment_scripts</w:t>
+            </w:r>
+            <w:r>
+              <w:t xml:space="preserve"> </w:t>
+            </w:r>
+            <w:r>
+              <w:t xml:space="preserve">— one Teaching-Guide Segment template per gold segment</w:t>
+            </w:r>
+          </w:p>
+        </w:tc>
+        <w:tc>
+          <w:tcPr/>
+          <w:p>
+            <w:pPr>
+              <w:pStyle w:val="Compact"/>
+            </w:pPr>
+          </w:p>
+        </w:tc>
+        <w:tc>
+          <w:tcPr/>
+          <w:p>
+            <w:pPr>
+              <w:pStyle w:val="Compact"/>
+            </w:pPr>
+          </w:p>
+        </w:tc>
+      </w:tr>
+      <w:tr>
+        <w:tc>
+          <w:tcPr/>
+          <w:p>
+            <w:pPr>
+              <w:pStyle w:val="Compact"/>
+            </w:pPr>
+            <w:r>
+              <w:t xml:space="preserve">Teaching Guide</w:t>
+            </w:r>
+          </w:p>
+        </w:tc>
+        <w:tc>
+          <w:tcPr/>
+          <w:p>
+            <w:pPr>
+              <w:pStyle w:val="Compact"/>
+            </w:pPr>
+            <w:r>
+              <w:rPr>
+                <w:rStyle w:val="VerbatimChar"/>
+              </w:rPr>
+              <w:t xml:space="preserve">Teaching_Guide/deck_outline</w:t>
+            </w:r>
+            <w:r>
+              <w:t xml:space="preserve"> </w:t>
+            </w:r>
+            <w:r>
+              <w:t xml:space="preserve">— whatever the room will show</w:t>
+            </w:r>
+          </w:p>
+        </w:tc>
+        <w:tc>
+          <w:tcPr/>
+          <w:p>
+            <w:pPr>
+              <w:pStyle w:val="Compact"/>
+            </w:pPr>
+          </w:p>
+        </w:tc>
+        <w:tc>
+          <w:tcPr/>
+          <w:p>
+            <w:pPr>
+              <w:pStyle w:val="Compact"/>
+            </w:pPr>
+          </w:p>
+        </w:tc>
+      </w:tr>
+    </w:tbl>
+    <w:bookmarkEnd w:id="53"/>
+    <w:bookmarkStart w:id="54" w:name="Xd836d7d29cb70a2cb01196f36fceabcf7dce515"/>
+    <w:p>
+      <w:pPr>
+        <w:pStyle w:val="Heading2"/>
+      </w:pPr>
+      <w:r>
+        <w:t xml:space="preserve">C. The ramp — one rung per student-facing piece</w:t>
+      </w:r>
+    </w:p>
+    <w:tbl>
+      <w:tblPr>
+        <w:tblStyle w:val="Table"/>
+        <w:tblW w:type="pct" w:w="5000"/>
+        <w:tblLayout w:type="fixed"/>
+        <w:tblLook w:firstRow="1" w:lastRow="0" w:firstColumn="0" w:lastColumn="0" w:noHBand="0" w:noVBand="0" w:val="0020"/>
+      </w:tblPr>
+      <w:tblGrid>
+        <w:gridCol w:w="1980"/>
+        <w:gridCol w:w="1980"/>
+        <w:gridCol w:w="1980"/>
+        <w:gridCol w:w="1980"/>
+      </w:tblGrid>
+      <w:tr>
+        <w:trPr>
+          <w:tblHeader w:val="on"/>
+        </w:trPr>
+        <w:tc>
+          <w:tcPr/>
+          <w:p>
+            <w:pPr>
+              <w:pStyle w:val="Compact"/>
+            </w:pPr>
+            <w:r>
+              <w:t xml:space="preserve">Piece (from B)</w:t>
+            </w:r>
+          </w:p>
+        </w:tc>
+        <w:tc>
+          <w:tcPr/>
+          <w:p>
+            <w:pPr>
+              <w:pStyle w:val="Compact"/>
+            </w:pPr>
+            <w:r>
+              <w:t xml:space="preserve">Rung: I do · we do · you do</w:t>
+            </w:r>
+          </w:p>
+        </w:tc>
+        <w:tc>
+          <w:tcPr/>
+          <w:p>
+            <w:pPr>
+              <w:pStyle w:val="Compact"/>
+            </w:pPr>
+            <w:r>
+              <w:t xml:space="preserve">What is removed at this rung</w:t>
+            </w:r>
+          </w:p>
+        </w:tc>
+        <w:tc>
+          <w:tcPr/>
+          <w:p>
+            <w:pPr>
+              <w:pStyle w:val="Compact"/>
+            </w:pPr>
+            <w:r>
+              <w:t xml:space="preserve">How the student knows they got it right (feedback without grades)</w:t>
+            </w:r>
+          </w:p>
+        </w:tc>
+      </w:tr>
+      <w:tr>
+        <w:tc>
+          <w:tcPr/>
+          <w:p>
+            <w:pPr>
+              <w:pStyle w:val="Compact"/>
+            </w:pPr>
+          </w:p>
+        </w:tc>
+        <w:tc>
+          <w:tcPr/>
+          <w:p>
+            <w:pPr>
+              <w:pStyle w:val="Compact"/>
+            </w:pPr>
+          </w:p>
+        </w:tc>
+        <w:tc>
+          <w:tcPr/>
+          <w:p>
+            <w:pPr>
+              <w:pStyle w:val="Compact"/>
+            </w:pPr>
+          </w:p>
+        </w:tc>
+        <w:tc>
+          <w:tcPr/>
+          <w:p>
+            <w:pPr>
+              <w:pStyle w:val="Compact"/>
+            </w:pPr>
+          </w:p>
+        </w:tc>
+      </w:tr>
+      <w:tr>
+        <w:tc>
+          <w:tcPr/>
+          <w:p>
+            <w:pPr>
+              <w:pStyle w:val="Compact"/>
+            </w:pPr>
+          </w:p>
+        </w:tc>
+        <w:tc>
+          <w:tcPr/>
+          <w:p>
+            <w:pPr>
+              <w:pStyle w:val="Compact"/>
+            </w:pPr>
+          </w:p>
+        </w:tc>
+        <w:tc>
+          <w:tcPr/>
+          <w:p>
+            <w:pPr>
+              <w:pStyle w:val="Compact"/>
+            </w:pPr>
+          </w:p>
+        </w:tc>
+        <w:tc>
+          <w:tcPr/>
+          <w:p>
+            <w:pPr>
+              <w:pStyle w:val="Compact"/>
+            </w:pPr>
+          </w:p>
+        </w:tc>
+      </w:tr>
+      <w:tr>
+        <w:tc>
+          <w:tcPr/>
+          <w:p>
+            <w:pPr>
+              <w:pStyle w:val="Compact"/>
+            </w:pPr>
+          </w:p>
+        </w:tc>
+        <w:tc>
+          <w:tcPr/>
+          <w:p>
+            <w:pPr>
+              <w:pStyle w:val="Compact"/>
+            </w:pPr>
+          </w:p>
+        </w:tc>
+        <w:tc>
+          <w:tcPr/>
+          <w:p>
+            <w:pPr>
+              <w:pStyle w:val="Compact"/>
+            </w:pPr>
+          </w:p>
+        </w:tc>
+        <w:tc>
+          <w:tcPr/>
+          <w:p>
+            <w:pPr>
+              <w:pStyle w:val="Compact"/>
+            </w:pPr>
+          </w:p>
+        </w:tc>
+      </w:tr>
+    </w:tbl>
+    <w:bookmarkEnd w:id="54"/>
+    <w:bookmarkStart w:id="55" w:name="Xc28953b98d50c9137f02fb6ddb392318a922086"/>
+    <w:p>
+      <w:pPr>
+        <w:pStyle w:val="Heading2"/>
+      </w:pPr>
+      <w:r>
+        <w:t xml:space="preserve">D. The agenda sketch — Time / Activity / Details</w:t>
+      </w:r>
+    </w:p>
+    <w:p>
+      <w:pPr>
+        <w:pStyle w:val="FirstParagraph"/>
+      </w:pPr>
+      <w:r>
+        <w:t xml:space="preserve">First estimates from the Contact-Hour companion. The precise budget lands in Week 4, once the materials exist.</w:t>
+      </w:r>
+    </w:p>
+    <w:tbl>
+      <w:tblPr>
+        <w:tblStyle w:val="Table"/>
+        <w:tblW w:type="auto" w:w="0"/>
+        <w:tblLook w:firstRow="1" w:lastRow="0" w:firstColumn="0" w:lastColumn="0" w:noHBand="0" w:noVBand="0" w:val="0020"/>
+      </w:tblPr>
+      <w:tblGrid>
+        <w:gridCol w:w="1584"/>
+        <w:gridCol w:w="1584"/>
+        <w:gridCol w:w="1584"/>
+        <w:gridCol w:w="1584"/>
+        <w:gridCol w:w="1584"/>
+      </w:tblGrid>
+      <w:tr>
+        <w:trPr>
+          <w:tblHeader w:val="on"/>
+        </w:trPr>
+        <w:tc>
+          <w:tcPr/>
+          <w:p>
+            <w:pPr>
+              <w:pStyle w:val="Compact"/>
+            </w:pPr>
+            <w:r>
+              <w:t xml:space="preserve">Time</w:t>
+            </w:r>
+          </w:p>
+        </w:tc>
+        <w:tc>
+          <w:tcPr/>
+          <w:p>
+            <w:pPr>
+              <w:pStyle w:val="Compact"/>
+            </w:pPr>
+            <w:r>
+              <w:t xml:space="preserve">Activity</w:t>
+            </w:r>
+          </w:p>
+        </w:tc>
+        <w:tc>
+          <w:tcPr/>
+          <w:p>
+            <w:pPr>
+              <w:pStyle w:val="Compact"/>
+            </w:pPr>
+            <w:r>
+              <w:t xml:space="preserve">Details</w:t>
+            </w:r>
+          </w:p>
+        </w:tc>
+        <w:tc>
+          <w:tcPr/>
+          <w:p>
+            <w:pPr>
+              <w:pStyle w:val="Compact"/>
+            </w:pPr>
+            <w:r>
+              <w:t xml:space="preserve">Tier (floor / gold)</w:t>
+            </w:r>
+          </w:p>
+        </w:tc>
+        <w:tc>
+          <w:tcPr/>
+          <w:p>
+            <w:pPr>
+              <w:pStyle w:val="Compact"/>
+            </w:pPr>
+            <w:r>
+              <w:t xml:space="preserve">Estimate</w:t>
+            </w:r>
+          </w:p>
+        </w:tc>
+      </w:tr>
+      <w:tr>
+        <w:tc>
+          <w:tcPr/>
+          <w:p>
+            <w:pPr>
+              <w:pStyle w:val="Compact"/>
+            </w:pPr>
+          </w:p>
+        </w:tc>
+        <w:tc>
+          <w:tcPr/>
+          <w:p>
+            <w:pPr>
+              <w:pStyle w:val="Compact"/>
+            </w:pPr>
+          </w:p>
+        </w:tc>
+        <w:tc>
+          <w:tcPr/>
+          <w:p>
+            <w:pPr>
+              <w:pStyle w:val="Compact"/>
+            </w:pPr>
+          </w:p>
+        </w:tc>
+        <w:tc>
+          <w:tcPr/>
+          <w:p>
+            <w:pPr>
+              <w:pStyle w:val="Compact"/>
+            </w:pPr>
+          </w:p>
+        </w:tc>
+        <w:tc>
+          <w:tcPr/>
+          <w:p>
+            <w:pPr>
+              <w:pStyle w:val="Compact"/>
+            </w:pPr>
+          </w:p>
+        </w:tc>
+      </w:tr>
+      <w:tr>
+        <w:tc>
+          <w:tcPr/>
+          <w:p>
+            <w:pPr>
+              <w:pStyle w:val="Compact"/>
+            </w:pPr>
+          </w:p>
+        </w:tc>
+        <w:tc>
+          <w:tcPr/>
+          <w:p>
+            <w:pPr>
+              <w:pStyle w:val="Compact"/>
+            </w:pPr>
+          </w:p>
+        </w:tc>
+        <w:tc>
+          <w:tcPr/>
+          <w:p>
+            <w:pPr>
+              <w:pStyle w:val="Compact"/>
+            </w:pPr>
+          </w:p>
+        </w:tc>
+        <w:tc>
+          <w:tcPr/>
+          <w:p>
+            <w:pPr>
+              <w:pStyle w:val="Compact"/>
+            </w:pPr>
+          </w:p>
+        </w:tc>
+        <w:tc>
+          <w:tcPr/>
+          <w:p>
+            <w:pPr>
+              <w:pStyle w:val="Compact"/>
+            </w:pPr>
+          </w:p>
+        </w:tc>
+      </w:tr>
+      <w:tr>
+        <w:tc>
+          <w:tcPr/>
+          <w:p>
+            <w:pPr>
+              <w:pStyle w:val="Compact"/>
+            </w:pPr>
+          </w:p>
+        </w:tc>
+        <w:tc>
+          <w:tcPr/>
+          <w:p>
+            <w:pPr>
+              <w:pStyle w:val="Compact"/>
+            </w:pPr>
+          </w:p>
+        </w:tc>
+        <w:tc>
+          <w:tcPr/>
+          <w:p>
+            <w:pPr>
+              <w:pStyle w:val="Compact"/>
+            </w:pPr>
+          </w:p>
+        </w:tc>
+        <w:tc>
+          <w:tcPr/>
+          <w:p>
+            <w:pPr>
+              <w:pStyle w:val="Compact"/>
+            </w:pPr>
+          </w:p>
+        </w:tc>
+        <w:tc>
+          <w:tcPr/>
+          <w:p>
+            <w:pPr>
+              <w:pStyle w:val="Compact"/>
+            </w:pPr>
+          </w:p>
+        </w:tc>
+      </w:tr>
+      <w:tr>
+        <w:tc>
+          <w:tcPr/>
+          <w:p>
+            <w:pPr>
+              <w:pStyle w:val="Compact"/>
+            </w:pPr>
+          </w:p>
+        </w:tc>
+        <w:tc>
+          <w:tcPr/>
+          <w:p>
+            <w:pPr>
+              <w:pStyle w:val="Compact"/>
+            </w:pPr>
+          </w:p>
+        </w:tc>
+        <w:tc>
+          <w:tcPr/>
+          <w:p>
+            <w:pPr>
+              <w:pStyle w:val="Compact"/>
+            </w:pPr>
+          </w:p>
+        </w:tc>
+        <w:tc>
+          <w:tcPr/>
+          <w:p>
+            <w:pPr>
+              <w:pStyle w:val="Compact"/>
+            </w:pPr>
+          </w:p>
+        </w:tc>
+        <w:tc>
+          <w:tcPr/>
+          <w:p>
+            <w:pPr>
+              <w:pStyle w:val="Compact"/>
+            </w:pPr>
+          </w:p>
+        </w:tc>
+      </w:tr>
+    </w:tbl>
     <w:p>
       <w:pPr>
         <w:pStyle w:val="BodyText"/>
@@ -4866,7 +6405,13 @@
           <w:b/>
           <w:bCs/>
         </w:rPr>
-        <w:t xml:space="preserve">Module Number &amp; Title:</w:t>
+        <w:t xml:space="preserve">Fits the container?</w:t>
+      </w:r>
+      <w:r>
+        <w:t xml:space="preserve"> </w:t>
+      </w:r>
+      <w:r>
+        <w:t xml:space="preserve">[fits · too big — what moves to pre- or post-class · too thin]</w:t>
       </w:r>
     </w:p>
     <w:p>
@@ -4878,452 +6423,194 @@
           <w:b/>
           <w:bCs/>
         </w:rPr>
-        <w:t xml:space="preserve">Module Introduction Paragraphs</w:t>
-      </w:r>
-      <w:r>
-        <w:t xml:space="preserve">:</w:t>
-      </w:r>
-      <w:r>
-        <w:t xml:space="preserve"> </w:t>
-      </w:r>
-      <w:r>
-        <w:rPr>
-          <w:i/>
-          <w:iCs/>
-        </w:rPr>
-        <w:t xml:space="preserve">[Enter module introduction here of approximately 2-4 paragraphs. The purpose of this paragraph is to help frame the instruction in the module so that students can learn it more easily. Try to use this paragraph to gain the learner’s attention. Using an anecdote or real-world example demonstrating the value of course content can work well. Also, remind students of material that has been covered in previous modules or in previous courses that will be expanded on in this module. Finally, explain to students why the material in this module may be important to them as future professionals in the field. Using references and citations can help demonstrate good academic behavior and is encouraged.]</w:t>
-      </w:r>
-    </w:p>
-    <w:p>
-      <w:pPr>
-        <w:pStyle w:val="SourceCode"/>
-      </w:pPr>
+        <w:t xml:space="preserve">Access, planned:</w:t>
+      </w:r>
+      <w:r>
+        <w:t xml:space="preserve"> </w:t>
+      </w:r>
+      <w:r>
+        <w:t xml:space="preserve">Represent — [ ] · Engage — [ ] · Show mastery — [ ]</w:t>
+      </w:r>
+    </w:p>
+    <w:p>
+      <w:r>
+        <w:br w:type="page"/>
+      </w:r>
+    </w:p>
+    <w:bookmarkEnd w:id="55"/>
+    <w:bookmarkEnd w:id="56"/>
+    <w:bookmarkStart w:id="69" w:name="week-3-teaching-guide-segment"/>
+    <w:p>
+      <w:pPr>
+        <w:pStyle w:val="Heading1"/>
+      </w:pPr>
+      <w:r>
+        <w:t xml:space="preserve">Week 3 — Teaching-Guide Segment</w:t>
+      </w:r>
+    </w:p>
+    <w:bookmarkStart w:id="57" w:name="teaching-guide-segment-template"/>
+    <w:p>
+      <w:pPr>
+        <w:pStyle w:val="Heading2"/>
+      </w:pPr>
+      <w:r>
+        <w:t xml:space="preserve">Teaching-Guide Segment — TEMPLATE</w:t>
+      </w:r>
+    </w:p>
+    <w:p>
+      <w:pPr>
+        <w:pStyle w:val="FirstParagraph"/>
+      </w:pPr>
+      <w:r>
+        <w:rPr>
+          <w:i/>
+          <w:iCs/>
+        </w:rPr>
+        <w:t xml:space="preserve">Guide Section 5. One page per segment of your live session. Each row of your minute-by-minute agenda becomes one of these. This depth is what makes</w:t>
+      </w:r>
+      <w:r>
+        <w:rPr>
+          <w:i/>
+          <w:iCs/>
+        </w:rPr>
+        <w:t xml:space="preserve"> </w:t>
+      </w:r>
+      <w:r>
+        <w:rPr>
+          <w:i/>
+          <w:iCs/>
+        </w:rPr>
+        <w:t xml:space="preserve">“anyone can teach it”</w:t>
+      </w:r>
+      <w:r>
+        <w:rPr>
+          <w:i/>
+          <w:iCs/>
+        </w:rPr>
+        <w:t xml:space="preserve"> </w:t>
+      </w:r>
+      <w:r>
+        <w:rPr>
+          <w:i/>
+          <w:iCs/>
+        </w:rPr>
+        <w:t xml:space="preserve">true. Filled models: the</w:t>
+      </w:r>
+      <w:r>
+        <w:rPr>
+          <w:i/>
+          <w:iCs/>
+        </w:rPr>
+        <w:t xml:space="preserve"> </w:t>
+      </w:r>
       <w:r>
         <w:rPr>
           <w:rStyle w:val="VerbatimChar"/>
-        </w:rPr>
-        <w:t xml:space="preserve">        Enter here…</w:t>
-      </w:r>
-    </w:p>
-    <w:p>
-      <w:pPr>
+          <w:i/>
+          <w:iCs/>
+        </w:rPr>
+        <w:t xml:space="preserve">Segment1_FULLY_SHOWN.md</w:t>
+      </w:r>
+      <w:r>
+        <w:rPr>
+          <w:i/>
+          <w:iCs/>
+        </w:rPr>
+        <w:t xml:space="preserve"> </w:t>
+      </w:r>
+      <w:r>
+        <w:rPr>
+          <w:i/>
+          <w:iCs/>
+        </w:rPr>
+        <w:t xml:space="preserve">file in either worked example.</w:t>
+      </w:r>
+    </w:p>
+    <w:p>
+      <w:r>
+        <w:pict>
+          <v:rect style="width:0;height:1.5pt" o:hralign="center" o:hrstd="t" o:hr="t"/>
+        </w:pict>
+      </w:r>
+    </w:p>
+    <w:bookmarkEnd w:id="57"/>
+    <w:bookmarkStart w:id="58" w:name="segment-n-title"/>
+    <w:p>
+      <w:pPr>
+        <w:pStyle w:val="Heading2"/>
+      </w:pPr>
+      <w:r>
+        <w:t xml:space="preserve">Segment [N]: [Title]</w:t>
+      </w:r>
+    </w:p>
+    <w:p>
+      <w:pPr>
+        <w:pStyle w:val="FirstParagraph"/>
+      </w:pPr>
+      <w:r>
+        <w:rPr>
+          <w:b/>
+          <w:bCs/>
+        </w:rPr>
+        <w:t xml:space="preserve">Time:</w:t>
+      </w:r>
+      <w:r>
+        <w:t xml:space="preserve"> </w:t>
+      </w:r>
+      <w:r>
+        <w:t xml:space="preserve">[start]–[end] ([X] minutes)</w:t>
+      </w:r>
+    </w:p>
+    <w:bookmarkEnd w:id="58"/>
+    <w:bookmarkStart w:id="59" w:name="segment-objectives"/>
+    <w:p>
+      <w:pPr>
+        <w:pStyle w:val="Heading2"/>
+      </w:pPr>
+      <w:r>
+        <w:t xml:space="preserve">Segment objectives</w:t>
+      </w:r>
+    </w:p>
+    <w:p>
+      <w:pPr>
+        <w:pStyle w:val="FirstParagraph"/>
+      </w:pPr>
+      <w:r>
+        <w:t xml:space="preserve">By the end of this segment, students will:</w:t>
+      </w:r>
+      <w:r>
+        <w:t xml:space="preserve"> </w:t>
+      </w:r>
+      <w:r>
+        <w:t xml:space="preserve">- …</w:t>
+      </w:r>
+      <w:r>
+        <w:t xml:space="preserve"> </w:t>
+      </w:r>
+      <w:r>
+        <w:t xml:space="preserve">- …</w:t>
+      </w:r>
+    </w:p>
+    <w:bookmarkEnd w:id="59"/>
+    <w:bookmarkStart w:id="60" w:name="materials-needed"/>
+    <w:p>
+      <w:pPr>
+        <w:pStyle w:val="Heading2"/>
+      </w:pPr>
+      <w:r>
+        <w:t xml:space="preserve">Materials needed</w:t>
+      </w:r>
+    </w:p>
+    <w:p>
+      <w:pPr>
+        <w:pStyle w:val="Compact"/>
         <w:numPr>
           <w:ilvl w:val="0"/>
           <w:numId w:val="1009"/>
         </w:numPr>
       </w:pPr>
       <w:r>
-        <w:rPr>
-          <w:b/>
-          <w:bCs/>
-        </w:rPr>
-        <w:t xml:space="preserve">Materials</w:t>
-      </w:r>
-      <w:r>
-        <w:t xml:space="preserve">:</w:t>
-      </w:r>
-      <w:r>
-        <w:t xml:space="preserve"> </w:t>
-      </w:r>
-      <w:r>
-        <w:rPr>
-          <w:i/>
-          <w:iCs/>
-        </w:rPr>
-        <w:t xml:space="preserve">[In order of priority, list the readings and videos that students will read and watch in this module. Please include a web link to any materials that are on the internet or a pdf document for those that you have copies of. If the material is something that we created, just list the name of it.]</w:t>
-      </w:r>
-      <w:r>
-        <w:br/>
-      </w:r>
-      <w:r>
-        <w:t xml:space="preserve">Enter here…</w:t>
-      </w:r>
-      <w:r>
-        <w:br/>
-      </w:r>
-    </w:p>
-    <w:p>
-      <w:pPr>
-        <w:numPr>
-          <w:ilvl w:val="0"/>
-          <w:numId w:val="1009"/>
-        </w:numPr>
-      </w:pPr>
-      <w:r>
-        <w:rPr>
-          <w:b/>
-          <w:bCs/>
-        </w:rPr>
-        <w:t xml:space="preserve">Discussion Assignment Prompts:</w:t>
-      </w:r>
-      <w:r>
-        <w:t xml:space="preserve"> </w:t>
-      </w:r>
-      <w:r>
-        <w:rPr>
-          <w:i/>
-          <w:iCs/>
-        </w:rPr>
-        <w:t xml:space="preserve">[Write the discussion assignment prompt for this module below. Please separate the prompts if there is more than 1 discussion assignment in this module.]</w:t>
-      </w:r>
-      <w:r>
-        <w:br/>
-      </w:r>
-      <w:r>
-        <w:t xml:space="preserve">Enter here…</w:t>
-      </w:r>
-      <w:r>
-        <w:br/>
-      </w:r>
-    </w:p>
-    <w:p>
-      <w:pPr>
-        <w:numPr>
-          <w:ilvl w:val="0"/>
-          <w:numId w:val="1009"/>
-        </w:numPr>
-      </w:pPr>
-      <w:r>
-        <w:rPr>
-          <w:b/>
-          <w:bCs/>
-        </w:rPr>
-        <w:t xml:space="preserve">Module Assignment/Assessment:</w:t>
-      </w:r>
-      <w:r>
-        <w:t xml:space="preserve"> </w:t>
-      </w:r>
-      <w:r>
-        <w:rPr>
-          <w:i/>
-          <w:iCs/>
-        </w:rPr>
-        <w:t xml:space="preserve">[If there are assignments in this module such as a module learning activity or paper, write the instructions below. Please copy and paste as necessary if there is more than 1. Include the following information in the prompt:</w:t>
-      </w:r>
-      <w:r>
-        <w:br/>
-      </w:r>
-      <w:r>
-        <w:rPr>
-          <w:i/>
-          <w:iCs/>
-        </w:rPr>
-        <w:t xml:space="preserve">Purpose - Why are students completing this assignment? Which module and course learning objectives is it related to? Are there any readings or other materials related to this assignment? If so, please list/identify them</w:t>
-      </w:r>
-      <w:r>
-        <w:br/>
-      </w:r>
-      <w:r>
-        <w:rPr>
-          <w:i/>
-          <w:iCs/>
-        </w:rPr>
-        <w:t xml:space="preserve">Directions - What are students doing and submitting here? Identify and explain everything students need to include in their submission here and how much of it they need as well.</w:t>
-      </w:r>
-      <w:r>
-        <w:br/>
-      </w:r>
-      <w:r>
-        <w:rPr>
-          <w:i/>
-          <w:iCs/>
-        </w:rPr>
-        <w:t xml:space="preserve">Feedback &amp; completion - How will students know they’ve done this well, and what feedback will they get? What marks it complete? (This method uses</w:t>
-      </w:r>
-      <w:r>
-        <w:rPr>
-          <w:i/>
-          <w:iCs/>
-        </w:rPr>
-        <w:t xml:space="preserve"> </w:t>
-      </w:r>
-      <w:r>
-        <w:rPr>
-          <w:b/>
-          <w:bCs/>
-          <w:i/>
-          <w:iCs/>
-        </w:rPr>
-        <w:t xml:space="preserve">completion + feedback, not grades</w:t>
-      </w:r>
-      <w:r>
-        <w:rPr>
-          <w:i/>
-          <w:iCs/>
-        </w:rPr>
-        <w:t xml:space="preserve"> </w:t>
-      </w:r>
-      <w:r>
-        <w:rPr>
-          <w:i/>
-          <w:iCs/>
-        </w:rPr>
-        <w:t xml:space="preserve">— describe the feedback and the bar for</w:t>
-      </w:r>
-      <w:r>
-        <w:rPr>
-          <w:i/>
-          <w:iCs/>
-        </w:rPr>
-        <w:t xml:space="preserve"> </w:t>
-      </w:r>
-      <w:r>
-        <w:rPr>
-          <w:i/>
-          <w:iCs/>
-        </w:rPr>
-        <w:t xml:space="preserve">“done,”</w:t>
-      </w:r>
-      <w:r>
-        <w:rPr>
-          <w:i/>
-          <w:iCs/>
-        </w:rPr>
-        <w:t xml:space="preserve"> </w:t>
-      </w:r>
-      <w:r>
-        <w:rPr>
-          <w:i/>
-          <w:iCs/>
-        </w:rPr>
-        <w:t xml:space="preserve">not a score or grade weight.)</w:t>
-      </w:r>
-      <w:r>
-        <w:br/>
-      </w:r>
-      <w:r>
-        <w:rPr>
-          <w:i/>
-          <w:iCs/>
-        </w:rPr>
-        <w:t xml:space="preserve">Attach a checklist or feedback rubric if you’ll use one — given to the learner as feedback, not as a score.</w:t>
-      </w:r>
-      <w:r>
-        <w:br/>
-      </w:r>
-      <w:r>
-        <w:rPr>
-          <w:i/>
-          <w:iCs/>
-        </w:rPr>
-        <w:t xml:space="preserve">Please include any other information that you think is necessary.]</w:t>
-      </w:r>
-      <w:r>
-        <w:br/>
-      </w:r>
-      <w:r>
-        <w:t xml:space="preserve">Enter here…</w:t>
-      </w:r>
-      <w:r>
-        <w:br/>
-      </w:r>
-    </w:p>
-    <w:p>
-      <w:pPr>
-        <w:numPr>
-          <w:ilvl w:val="0"/>
-          <w:numId w:val="1009"/>
-        </w:numPr>
-      </w:pPr>
-      <w:r>
-        <w:rPr>
-          <w:b/>
-          <w:bCs/>
-        </w:rPr>
-        <w:t xml:space="preserve">Module Conclusion:</w:t>
-      </w:r>
-      <w:r>
-        <w:t xml:space="preserve"> </w:t>
-      </w:r>
-      <w:r>
-        <w:rPr>
-          <w:i/>
-          <w:iCs/>
-        </w:rPr>
-        <w:t xml:space="preserve">[Enter module conclusion information. A paragraph wrapping up the module and pivoting towards the next module is sufficient.]</w:t>
-      </w:r>
-    </w:p>
-    <w:p>
-      <w:pPr>
-        <w:pStyle w:val="SourceCode"/>
-        <w:numPr>
-          <w:ilvl w:val="0"/>
-          <w:numId w:val="1000"/>
-        </w:numPr>
-      </w:pPr>
-      <w:r>
-        <w:rPr>
-          <w:rStyle w:val="VerbatimChar"/>
-        </w:rPr>
-        <w:t xml:space="preserve">     Enter here...</w:t>
-      </w:r>
-    </w:p>
-    <w:p>
-      <w:r>
-        <w:br w:type="page"/>
-      </w:r>
-    </w:p>
-    <w:bookmarkEnd w:id="51"/>
-    <w:bookmarkStart w:id="64" w:name="week-3-teaching-guide-segment"/>
-    <w:p>
-      <w:pPr>
-        <w:pStyle w:val="Heading1"/>
-      </w:pPr>
-      <w:r>
-        <w:t xml:space="preserve">Week 3 — Teaching-Guide Segment</w:t>
-      </w:r>
-    </w:p>
-    <w:bookmarkStart w:id="52" w:name="teaching-guide-segment-template"/>
-    <w:p>
-      <w:pPr>
-        <w:pStyle w:val="Heading2"/>
-      </w:pPr>
-      <w:r>
-        <w:t xml:space="preserve">Teaching-Guide Segment — TEMPLATE</w:t>
-      </w:r>
-    </w:p>
-    <w:p>
-      <w:pPr>
-        <w:pStyle w:val="FirstParagraph"/>
-      </w:pPr>
-      <w:r>
-        <w:rPr>
-          <w:i/>
-          <w:iCs/>
-        </w:rPr>
-        <w:t xml:space="preserve">Guide Section 5. One page per segment of your live session. Each row of your minute-by-minute agenda becomes one of these. This depth is what makes</w:t>
-      </w:r>
-      <w:r>
-        <w:rPr>
-          <w:i/>
-          <w:iCs/>
-        </w:rPr>
-        <w:t xml:space="preserve"> </w:t>
-      </w:r>
-      <w:r>
-        <w:rPr>
-          <w:i/>
-          <w:iCs/>
-        </w:rPr>
-        <w:t xml:space="preserve">“anyone can teach it”</w:t>
-      </w:r>
-      <w:r>
-        <w:rPr>
-          <w:i/>
-          <w:iCs/>
-        </w:rPr>
-        <w:t xml:space="preserve"> </w:t>
-      </w:r>
-      <w:r>
-        <w:rPr>
-          <w:i/>
-          <w:iCs/>
-        </w:rPr>
-        <w:t xml:space="preserve">true. Filled models: the</w:t>
-      </w:r>
-      <w:r>
-        <w:rPr>
-          <w:i/>
-          <w:iCs/>
-        </w:rPr>
-        <w:t xml:space="preserve"> </w:t>
-      </w:r>
-      <w:r>
-        <w:rPr>
-          <w:rStyle w:val="VerbatimChar"/>
-          <w:i/>
-          <w:iCs/>
-        </w:rPr>
-        <w:t xml:space="preserve">Segment1_FULLY_SHOWN.md</w:t>
-      </w:r>
-      <w:r>
-        <w:rPr>
-          <w:i/>
-          <w:iCs/>
-        </w:rPr>
-        <w:t xml:space="preserve"> </w:t>
-      </w:r>
-      <w:r>
-        <w:rPr>
-          <w:i/>
-          <w:iCs/>
-        </w:rPr>
-        <w:t xml:space="preserve">file in either worked example.</w:t>
-      </w:r>
-    </w:p>
-    <w:p>
-      <w:r>
-        <w:pict>
-          <v:rect style="width:0;height:1.5pt" o:hralign="center" o:hrstd="t" o:hr="t"/>
-        </w:pict>
-      </w:r>
-    </w:p>
-    <w:bookmarkEnd w:id="52"/>
-    <w:bookmarkStart w:id="53" w:name="segment-n-title"/>
-    <w:p>
-      <w:pPr>
-        <w:pStyle w:val="Heading2"/>
-      </w:pPr>
-      <w:r>
-        <w:t xml:space="preserve">Segment [N]: [Title]</w:t>
-      </w:r>
-    </w:p>
-    <w:p>
-      <w:pPr>
-        <w:pStyle w:val="FirstParagraph"/>
-      </w:pPr>
-      <w:r>
-        <w:rPr>
-          <w:b/>
-          <w:bCs/>
-        </w:rPr>
-        <w:t xml:space="preserve">Time:</w:t>
-      </w:r>
-      <w:r>
-        <w:t xml:space="preserve"> </w:t>
-      </w:r>
-      <w:r>
-        <w:t xml:space="preserve">[start]–[end] ([X] minutes)</w:t>
-      </w:r>
-    </w:p>
-    <w:bookmarkEnd w:id="53"/>
-    <w:bookmarkStart w:id="54" w:name="segment-objectives"/>
-    <w:p>
-      <w:pPr>
-        <w:pStyle w:val="Heading2"/>
-      </w:pPr>
-      <w:r>
-        <w:t xml:space="preserve">Segment objectives</w:t>
-      </w:r>
-    </w:p>
-    <w:p>
-      <w:pPr>
-        <w:pStyle w:val="FirstParagraph"/>
-      </w:pPr>
-      <w:r>
-        <w:t xml:space="preserve">By the end of this segment, students will:</w:t>
-      </w:r>
-      <w:r>
-        <w:t xml:space="preserve"> </w:t>
-      </w:r>
-      <w:r>
-        <w:t xml:space="preserve">- …</w:t>
-      </w:r>
-      <w:r>
-        <w:t xml:space="preserve"> </w:t>
-      </w:r>
-      <w:r>
-        <w:t xml:space="preserve">- …</w:t>
-      </w:r>
-    </w:p>
-    <w:bookmarkEnd w:id="54"/>
-    <w:bookmarkStart w:id="55" w:name="materials-needed"/>
-    <w:p>
-      <w:pPr>
-        <w:pStyle w:val="Heading2"/>
-      </w:pPr>
-      <w:r>
-        <w:t xml:space="preserve">Materials needed</w:t>
+        <w:t xml:space="preserve">…</w:t>
       </w:r>
     </w:p>
     <w:p>
@@ -5338,6 +6625,200 @@
         <w:t xml:space="preserve">…</w:t>
       </w:r>
     </w:p>
+    <w:bookmarkEnd w:id="60"/>
+    <w:bookmarkStart w:id="63" w:name="verbatim-instructor-script"/>
+    <w:p>
+      <w:pPr>
+        <w:pStyle w:val="Heading2"/>
+      </w:pPr>
+      <w:r>
+        <w:t xml:space="preserve">Verbatim instructor script</w:t>
+      </w:r>
+    </w:p>
+    <w:bookmarkStart w:id="61" w:name="x-sub-segment-label"/>
+    <w:p>
+      <w:pPr>
+        <w:pStyle w:val="Heading3"/>
+      </w:pPr>
+      <w:r>
+        <w:t xml:space="preserve">[0:00–0:0X] [sub-segment label]</w:t>
+      </w:r>
+    </w:p>
+    <w:p>
+      <w:pPr>
+        <w:pStyle w:val="BlockText"/>
+      </w:pPr>
+      <w:r>
+        <w:t xml:space="preserve">“[What to say, word for word. You won’t read it robotically — it’s so you know exactly what to convey.]”</w:t>
+      </w:r>
+    </w:p>
+    <w:p>
+      <w:pPr>
+        <w:pStyle w:val="FirstParagraph"/>
+      </w:pPr>
+      <w:r>
+        <w:t xml:space="preserve">[STAGE CUE — e.g., SHOW slide / WRITE on board / DRAW diagram / PAUSE / WAIT for responses]</w:t>
+      </w:r>
+    </w:p>
+    <w:p>
+      <w:pPr>
+        <w:pStyle w:val="BodyText"/>
+      </w:pPr>
+      <w:r>
+        <w:rPr>
+          <w:i/>
+          <w:iCs/>
+        </w:rPr>
+        <w:t xml:space="preserve">Add the cues your medium needs. A shop floor wants</w:t>
+      </w:r>
+      <w:r>
+        <w:rPr>
+          <w:i/>
+          <w:iCs/>
+        </w:rPr>
+        <w:t xml:space="preserve"> </w:t>
+      </w:r>
+      <w:r>
+        <w:rPr>
+          <w:rStyle w:val="VerbatimChar"/>
+          <w:i/>
+          <w:iCs/>
+        </w:rPr>
+        <w:t xml:space="preserve">[DEMO at machine]</w:t>
+      </w:r>
+      <w:r>
+        <w:rPr>
+          <w:i/>
+          <w:iCs/>
+        </w:rPr>
+        <w:t xml:space="preserve">,</w:t>
+      </w:r>
+      <w:r>
+        <w:rPr>
+          <w:i/>
+          <w:iCs/>
+        </w:rPr>
+        <w:t xml:space="preserve"> </w:t>
+      </w:r>
+      <w:r>
+        <w:rPr>
+          <w:rStyle w:val="VerbatimChar"/>
+          <w:i/>
+          <w:iCs/>
+        </w:rPr>
+        <w:t xml:space="preserve">[WALK to station]</w:t>
+      </w:r>
+      <w:r>
+        <w:rPr>
+          <w:i/>
+          <w:iCs/>
+        </w:rPr>
+        <w:t xml:space="preserve">,</w:t>
+      </w:r>
+      <w:r>
+        <w:rPr>
+          <w:i/>
+          <w:iCs/>
+        </w:rPr>
+        <w:t xml:space="preserve"> </w:t>
+      </w:r>
+      <w:r>
+        <w:rPr>
+          <w:rStyle w:val="VerbatimChar"/>
+          <w:i/>
+          <w:iCs/>
+        </w:rPr>
+        <w:t xml:space="preserve">[HAND OUT]</w:t>
+      </w:r>
+      <w:r>
+        <w:rPr>
+          <w:i/>
+          <w:iCs/>
+        </w:rPr>
+        <w:t xml:space="preserve">,</w:t>
+      </w:r>
+      <w:r>
+        <w:rPr>
+          <w:i/>
+          <w:iCs/>
+        </w:rPr>
+        <w:t xml:space="preserve"> </w:t>
+      </w:r>
+      <w:r>
+        <w:rPr>
+          <w:rStyle w:val="VerbatimChar"/>
+          <w:i/>
+          <w:iCs/>
+        </w:rPr>
+        <w:t xml:space="preserve">[SAFETY CHECK]</w:t>
+      </w:r>
+      <w:r>
+        <w:rPr>
+          <w:i/>
+          <w:iCs/>
+        </w:rPr>
+        <w:t xml:space="preserve">; a discussion wants</w:t>
+      </w:r>
+      <w:r>
+        <w:rPr>
+          <w:i/>
+          <w:iCs/>
+        </w:rPr>
+        <w:t xml:space="preserve"> </w:t>
+      </w:r>
+      <w:r>
+        <w:rPr>
+          <w:rStyle w:val="VerbatimChar"/>
+          <w:i/>
+          <w:iCs/>
+        </w:rPr>
+        <w:t xml:space="preserve">[HARVEST answers]</w:t>
+      </w:r>
+      <w:r>
+        <w:rPr>
+          <w:i/>
+          <w:iCs/>
+        </w:rPr>
+        <w:t xml:space="preserve">,</w:t>
+      </w:r>
+      <w:r>
+        <w:rPr>
+          <w:i/>
+          <w:iCs/>
+        </w:rPr>
+        <w:t xml:space="preserve"> </w:t>
+      </w:r>
+      <w:r>
+        <w:rPr>
+          <w:rStyle w:val="VerbatimChar"/>
+          <w:i/>
+          <w:iCs/>
+        </w:rPr>
+        <w:t xml:space="preserve">[SILENCE — count ten]</w:t>
+      </w:r>
+      <w:r>
+        <w:rPr>
+          <w:i/>
+          <w:iCs/>
+        </w:rPr>
+        <w:t xml:space="preserve">. The list above is screen-shaped because most courses are; yours may not be.</w:t>
+      </w:r>
+    </w:p>
+    <w:p>
+      <w:pPr>
+        <w:pStyle w:val="BodyText"/>
+      </w:pPr>
+      <w:r>
+        <w:rPr>
+          <w:b/>
+          <w:bCs/>
+        </w:rPr>
+        <w:t xml:space="preserve">If this segment is a discussion</w:t>
+      </w:r>
+      <w:r>
+        <w:t xml:space="preserve">, the script is less about what you say and more about what you do with what they say. Four moves worth writing down in advance:</w:t>
+      </w:r>
+    </w:p>
     <w:p>
       <w:pPr>
         <w:pStyle w:val="Compact"/>
@@ -5347,26 +6828,402 @@
         </w:numPr>
       </w:pPr>
       <w:r>
-        <w:t xml:space="preserve">…</w:t>
-      </w:r>
-    </w:p>
-    <w:bookmarkEnd w:id="55"/>
-    <w:bookmarkStart w:id="58" w:name="verbatim-instructor-script"/>
+        <w:rPr>
+          <w:b/>
+          <w:bCs/>
+        </w:rPr>
+        <w:t xml:space="preserve">Harvest in their words.</w:t>
+      </w:r>
+      <w:r>
+        <w:t xml:space="preserve"> </w:t>
+      </w:r>
+      <w:r>
+        <w:t xml:space="preserve">Write answers on the board as they said them, not as you’d have phrased them. Rewording on the spot tells the room their version was wrong.</w:t>
+      </w:r>
+    </w:p>
+    <w:p>
+      <w:pPr>
+        <w:pStyle w:val="Compact"/>
+        <w:numPr>
+          <w:ilvl w:val="0"/>
+          <w:numId w:val="1011"/>
+        </w:numPr>
+      </w:pPr>
+      <w:r>
+        <w:rPr>
+          <w:b/>
+          <w:bCs/>
+        </w:rPr>
+        <w:t xml:space="preserve">Decide beforehand whether this segment converges.</w:t>
+      </w:r>
+      <w:r>
+        <w:t xml:space="preserve"> </w:t>
+      </w:r>
+      <w:r>
+        <w:t xml:space="preserve">Some discussions end in one answer; some end in a well-mapped disagreement. Both are fine — but you have to know which you’re running, or you’ll cut it off at the wrong moment.</w:t>
+      </w:r>
+    </w:p>
+    <w:p>
+      <w:pPr>
+        <w:pStyle w:val="Compact"/>
+        <w:numPr>
+          <w:ilvl w:val="0"/>
+          <w:numId w:val="1011"/>
+        </w:numPr>
+      </w:pPr>
+      <w:r>
+        <w:rPr>
+          <w:b/>
+          <w:bCs/>
+        </w:rPr>
+        <w:t xml:space="preserve">Count ten seconds of silence.</w:t>
+      </w:r>
+      <w:r>
+        <w:t xml:space="preserve"> </w:t>
+      </w:r>
+      <w:r>
+        <w:t xml:space="preserve">It will feel like a minute. The second half of the wait is where the quieter people speak.</w:t>
+      </w:r>
+    </w:p>
+    <w:p>
+      <w:pPr>
+        <w:pStyle w:val="Compact"/>
+        <w:numPr>
+          <w:ilvl w:val="0"/>
+          <w:numId w:val="1011"/>
+        </w:numPr>
+      </w:pPr>
+      <w:r>
+        <w:rPr>
+          <w:b/>
+          <w:bCs/>
+        </w:rPr>
+        <w:t xml:space="preserve">For a plausible-but-wrong answer:</w:t>
+      </w:r>
+      <w:r>
+        <w:t xml:space="preserve"> </w:t>
+      </w:r>
+      <w:r>
+        <w:t xml:space="preserve">“say more about that”</w:t>
+      </w:r>
+      <w:r>
+        <w:t xml:space="preserve"> </w:t>
+      </w:r>
+      <w:r>
+        <w:t xml:space="preserve">— it surfaces the reasoning, which is the thing that actually needs correcting.</w:t>
+      </w:r>
+      <w:r>
+        <w:t xml:space="preserve"> </w:t>
+      </w:r>
+      <w:r>
+        <w:rPr>
+          <w:b/>
+          <w:bCs/>
+        </w:rPr>
+        <w:t xml:space="preserve">For the one loud voice:</w:t>
+      </w:r>
+      <w:r>
+        <w:t xml:space="preserve"> </w:t>
+      </w:r>
+      <w:r>
+        <w:t xml:space="preserve">“let’s hear two more before we judge.”</w:t>
+      </w:r>
+    </w:p>
+    <w:p>
+      <w:pPr>
+        <w:pStyle w:val="FirstParagraph"/>
+      </w:pPr>
+      <w:r>
+        <w:rPr>
+          <w:b/>
+          <w:bCs/>
+        </w:rPr>
+        <w:t xml:space="preserve">Teaching tips:</w:t>
+      </w:r>
+      <w:r>
+        <w:t xml:space="preserve"> </w:t>
+      </w:r>
+      <w:r>
+        <w:t xml:space="preserve">- …</w:t>
+      </w:r>
+      <w:r>
+        <w:t xml:space="preserve"> </w:t>
+      </w:r>
+      <w:r>
+        <w:t xml:space="preserve">- …</w:t>
+      </w:r>
+    </w:p>
+    <w:bookmarkEnd w:id="61"/>
+    <w:bookmarkStart w:id="62" w:name="x00y-next-sub-segment"/>
+    <w:p>
+      <w:pPr>
+        <w:pStyle w:val="Heading3"/>
+      </w:pPr>
+      <w:r>
+        <w:t xml:space="preserve">[0:0X–0:0Y] [next sub-segment]</w:t>
+      </w:r>
+    </w:p>
+    <w:p>
+      <w:pPr>
+        <w:pStyle w:val="BlockText"/>
+      </w:pPr>
+      <w:r>
+        <w:t xml:space="preserve">“…”</w:t>
+      </w:r>
+    </w:p>
+    <w:p>
+      <w:pPr>
+        <w:pStyle w:val="FirstParagraph"/>
+      </w:pPr>
+      <w:r>
+        <w:rPr>
+          <w:b/>
+          <w:bCs/>
+        </w:rPr>
+        <w:t xml:space="preserve">Teaching tips:</w:t>
+      </w:r>
+      <w:r>
+        <w:t xml:space="preserve"> </w:t>
+      </w:r>
+      <w:r>
+        <w:t xml:space="preserve">- …</w:t>
+      </w:r>
+    </w:p>
+    <w:p>
+      <w:pPr>
+        <w:pStyle w:val="BodyText"/>
+      </w:pPr>
+      <w:r>
+        <w:rPr>
+          <w:i/>
+          <w:iCs/>
+        </w:rPr>
+        <w:t xml:space="preserve">(Repeat one sub-block per chunk of the segment.)</w:t>
+      </w:r>
+    </w:p>
+    <w:bookmarkEnd w:id="62"/>
+    <w:bookmarkEnd w:id="63"/>
+    <w:bookmarkStart w:id="64" w:name="X1cc1e931be4cdd904d06a52a0e3917166f5a75d"/>
     <w:p>
       <w:pPr>
         <w:pStyle w:val="Heading2"/>
       </w:pPr>
       <w:r>
-        <w:t xml:space="preserve">Verbatim instructor script</w:t>
-      </w:r>
-    </w:p>
-    <w:bookmarkStart w:id="56" w:name="x-sub-segment-label"/>
-    <w:p>
-      <w:pPr>
-        <w:pStyle w:val="Heading3"/>
-      </w:pPr>
-      <w:r>
-        <w:t xml:space="preserve">[0:00–0:0X] [sub-segment label]</w:t>
+        <w:t xml:space="preserve">Engagement questions (instructor-posed; sprinkle through the segment)</w:t>
+      </w:r>
+    </w:p>
+    <w:p>
+      <w:pPr>
+        <w:pStyle w:val="FirstParagraph"/>
+      </w:pPr>
+      <w:r>
+        <w:rPr>
+          <w:i/>
+          <w:iCs/>
+        </w:rPr>
+        <w:t xml:space="preserve">1–2 heart-of-the-lesson probes — the intuition to grab, where people go wrong, or a</w:t>
+      </w:r>
+      <w:r>
+        <w:rPr>
+          <w:i/>
+          <w:iCs/>
+        </w:rPr>
+        <w:t xml:space="preserve"> </w:t>
+      </w:r>
+      <w:r>
+        <w:rPr>
+          <w:i/>
+          <w:iCs/>
+        </w:rPr>
+        <w:t xml:space="preserve">“why does this matter to you?”</w:t>
+      </w:r>
+      <w:r>
+        <w:rPr>
+          <w:i/>
+          <w:iCs/>
+        </w:rPr>
+        <w:t xml:space="preserve"> </w:t>
+      </w:r>
+      <w:r>
+        <w:rPr>
+          <w:i/>
+          <w:iCs/>
+        </w:rPr>
+        <w:t xml:space="preserve">hook. Mark each with [WAIT for responses]. (Different from the student questions below — these are what YOU ask THEM.)</w:t>
+      </w:r>
+      <w:r>
+        <w:t xml:space="preserve"> </w:t>
+      </w:r>
+      <w:r>
+        <w:t xml:space="preserve">-</w:t>
+      </w:r>
+      <w:r>
+        <w:t xml:space="preserve"> </w:t>
+      </w:r>
+      <w:r>
+        <w:t xml:space="preserve">“…?”</w:t>
+      </w:r>
+      <w:r>
+        <w:t xml:space="preserve"> </w:t>
+      </w:r>
+      <w:r>
+        <w:t xml:space="preserve">[WAIT for responses]</w:t>
+      </w:r>
+    </w:p>
+    <w:bookmarkEnd w:id="64"/>
+    <w:bookmarkStart w:id="65" w:name="common-student-questions-with-answers"/>
+    <w:p>
+      <w:pPr>
+        <w:pStyle w:val="Heading2"/>
+      </w:pPr>
+      <w:r>
+        <w:t xml:space="preserve">Common student questions (with answers)</w:t>
+      </w:r>
+    </w:p>
+    <w:p>
+      <w:pPr>
+        <w:pStyle w:val="FirstParagraph"/>
+      </w:pPr>
+      <w:r>
+        <w:rPr>
+          <w:b/>
+          <w:bCs/>
+        </w:rPr>
+        <w:t xml:space="preserve">Q:</w:t>
+      </w:r>
+      <w:r>
+        <w:rPr>
+          <w:b/>
+          <w:bCs/>
+        </w:rPr>
+        <w:t xml:space="preserve"> </w:t>
+      </w:r>
+      <w:r>
+        <w:rPr>
+          <w:b/>
+          <w:bCs/>
+        </w:rPr>
+        <w:t xml:space="preserve">“…?”</w:t>
+      </w:r>
+      <w:r>
+        <w:t xml:space="preserve"> </w:t>
+      </w:r>
+      <w:r>
+        <w:rPr>
+          <w:b/>
+          <w:bCs/>
+        </w:rPr>
+        <w:t xml:space="preserve">A:</w:t>
+      </w:r>
+      <w:r>
+        <w:t xml:space="preserve"> </w:t>
+      </w:r>
+      <w:r>
+        <w:t xml:space="preserve">“…”</w:t>
+      </w:r>
+    </w:p>
+    <w:p>
+      <w:pPr>
+        <w:pStyle w:val="BodyText"/>
+      </w:pPr>
+      <w:r>
+        <w:rPr>
+          <w:b/>
+          <w:bCs/>
+        </w:rPr>
+        <w:t xml:space="preserve">Q:</w:t>
+      </w:r>
+      <w:r>
+        <w:rPr>
+          <w:b/>
+          <w:bCs/>
+        </w:rPr>
+        <w:t xml:space="preserve"> </w:t>
+      </w:r>
+      <w:r>
+        <w:rPr>
+          <w:b/>
+          <w:bCs/>
+        </w:rPr>
+        <w:t xml:space="preserve">“…?”</w:t>
+      </w:r>
+      <w:r>
+        <w:t xml:space="preserve"> </w:t>
+      </w:r>
+      <w:r>
+        <w:rPr>
+          <w:b/>
+          <w:bCs/>
+        </w:rPr>
+        <w:t xml:space="preserve">A:</w:t>
+      </w:r>
+      <w:r>
+        <w:t xml:space="preserve"> </w:t>
+      </w:r>
+      <w:r>
+        <w:t xml:space="preserve">“…”</w:t>
+      </w:r>
+    </w:p>
+    <w:bookmarkEnd w:id="65"/>
+    <w:bookmarkStart w:id="66" w:name="segment-checklist"/>
+    <w:p>
+      <w:pPr>
+        <w:pStyle w:val="Heading2"/>
+      </w:pPr>
+      <w:r>
+        <w:t xml:space="preserve">Segment checklist</w:t>
+      </w:r>
+    </w:p>
+    <w:p>
+      <w:pPr>
+        <w:pStyle w:val="FirstParagraph"/>
+      </w:pPr>
+      <w:r>
+        <w:t xml:space="preserve">Before moving on, ensure:</w:t>
+      </w:r>
+      <w:r>
+        <w:t xml:space="preserve"> </w:t>
+      </w:r>
+      <w:r>
+        <w:t xml:space="preserve">- [ ] …</w:t>
+      </w:r>
+      <w:r>
+        <w:t xml:space="preserve"> </w:t>
+      </w:r>
+      <w:r>
+        <w:t xml:space="preserve">- [ ]</w:t>
+      </w:r>
+      <w:r>
+        <w:t xml:space="preserve"> </w:t>
+      </w:r>
+      <w:r>
+        <w:rPr>
+          <w:b/>
+          <w:bCs/>
+        </w:rPr>
+        <w:t xml:space="preserve">You’re at [time]</w:t>
+      </w:r>
+      <w:r>
+        <w:t xml:space="preserve"> </w:t>
+      </w:r>
+      <w:r>
+        <w:t xml:space="preserve">(timing checkpoint)</w:t>
+      </w:r>
+      <w:r>
+        <w:t xml:space="preserve"> </w:t>
+      </w:r>
+      <w:r>
+        <w:t xml:space="preserve">- [ ] Transition to the next segment is ready</w:t>
+      </w:r>
+    </w:p>
+    <w:bookmarkEnd w:id="66"/>
+    <w:bookmarkStart w:id="67" w:name="transition-to-next-segment"/>
+    <w:p>
+      <w:pPr>
+        <w:pStyle w:val="Heading2"/>
+      </w:pPr>
+      <w:r>
+        <w:t xml:space="preserve">Transition to next segment</w:t>
       </w:r>
     </w:p>
     <w:p>
@@ -5374,174 +7231,17 @@
         <w:pStyle w:val="BlockText"/>
       </w:pPr>
       <w:r>
-        <w:t xml:space="preserve">“[What to say, word for word. You won’t read it robotically — it’s so you know exactly what to convey.]”</w:t>
-      </w:r>
-    </w:p>
-    <w:p>
-      <w:pPr>
-        <w:pStyle w:val="FirstParagraph"/>
-      </w:pPr>
-      <w:r>
-        <w:t xml:space="preserve">[STAGE CUE — e.g., SHOW slide / WRITE on board / DRAW diagram / PAUSE / WAIT for responses]</w:t>
-      </w:r>
-    </w:p>
-    <w:p>
-      <w:pPr>
-        <w:pStyle w:val="BodyText"/>
-      </w:pPr>
-      <w:r>
-        <w:rPr>
-          <w:i/>
-          <w:iCs/>
-        </w:rPr>
-        <w:t xml:space="preserve">Add the cues your medium needs. A shop floor wants</w:t>
-      </w:r>
-      <w:r>
-        <w:rPr>
-          <w:i/>
-          <w:iCs/>
-        </w:rPr>
-        <w:t xml:space="preserve"> </w:t>
-      </w:r>
-      <w:r>
-        <w:rPr>
-          <w:rStyle w:val="VerbatimChar"/>
-          <w:i/>
-          <w:iCs/>
-        </w:rPr>
-        <w:t xml:space="preserve">[DEMO at machine]</w:t>
-      </w:r>
-      <w:r>
-        <w:rPr>
-          <w:i/>
-          <w:iCs/>
-        </w:rPr>
-        <w:t xml:space="preserve">,</w:t>
-      </w:r>
-      <w:r>
-        <w:rPr>
-          <w:i/>
-          <w:iCs/>
-        </w:rPr>
-        <w:t xml:space="preserve"> </w:t>
-      </w:r>
-      <w:r>
-        <w:rPr>
-          <w:rStyle w:val="VerbatimChar"/>
-          <w:i/>
-          <w:iCs/>
-        </w:rPr>
-        <w:t xml:space="preserve">[WALK to station]</w:t>
-      </w:r>
-      <w:r>
-        <w:rPr>
-          <w:i/>
-          <w:iCs/>
-        </w:rPr>
-        <w:t xml:space="preserve">,</w:t>
-      </w:r>
-      <w:r>
-        <w:rPr>
-          <w:i/>
-          <w:iCs/>
-        </w:rPr>
-        <w:t xml:space="preserve"> </w:t>
-      </w:r>
-      <w:r>
-        <w:rPr>
-          <w:rStyle w:val="VerbatimChar"/>
-          <w:i/>
-          <w:iCs/>
-        </w:rPr>
-        <w:t xml:space="preserve">[HAND OUT]</w:t>
-      </w:r>
-      <w:r>
-        <w:rPr>
-          <w:i/>
-          <w:iCs/>
-        </w:rPr>
-        <w:t xml:space="preserve">,</w:t>
-      </w:r>
-      <w:r>
-        <w:rPr>
-          <w:i/>
-          <w:iCs/>
-        </w:rPr>
-        <w:t xml:space="preserve"> </w:t>
-      </w:r>
-      <w:r>
-        <w:rPr>
-          <w:rStyle w:val="VerbatimChar"/>
-          <w:i/>
-          <w:iCs/>
-        </w:rPr>
-        <w:t xml:space="preserve">[SAFETY CHECK]</w:t>
-      </w:r>
-      <w:r>
-        <w:rPr>
-          <w:i/>
-          <w:iCs/>
-        </w:rPr>
-        <w:t xml:space="preserve">; a discussion wants</w:t>
-      </w:r>
-      <w:r>
-        <w:rPr>
-          <w:i/>
-          <w:iCs/>
-        </w:rPr>
-        <w:t xml:space="preserve"> </w:t>
-      </w:r>
-      <w:r>
-        <w:rPr>
-          <w:rStyle w:val="VerbatimChar"/>
-          <w:i/>
-          <w:iCs/>
-        </w:rPr>
-        <w:t xml:space="preserve">[HARVEST answers]</w:t>
-      </w:r>
-      <w:r>
-        <w:rPr>
-          <w:i/>
-          <w:iCs/>
-        </w:rPr>
-        <w:t xml:space="preserve">,</w:t>
-      </w:r>
-      <w:r>
-        <w:rPr>
-          <w:i/>
-          <w:iCs/>
-        </w:rPr>
-        <w:t xml:space="preserve"> </w:t>
-      </w:r>
-      <w:r>
-        <w:rPr>
-          <w:rStyle w:val="VerbatimChar"/>
-          <w:i/>
-          <w:iCs/>
-        </w:rPr>
-        <w:t xml:space="preserve">[SILENCE — count ten]</w:t>
-      </w:r>
-      <w:r>
-        <w:rPr>
-          <w:i/>
-          <w:iCs/>
-        </w:rPr>
-        <w:t xml:space="preserve">. The list above is screen-shaped because most courses are; yours may not be.</w:t>
-      </w:r>
-    </w:p>
-    <w:p>
-      <w:pPr>
-        <w:pStyle w:val="BodyText"/>
-      </w:pPr>
-      <w:r>
-        <w:rPr>
-          <w:b/>
-          <w:bCs/>
-        </w:rPr>
-        <w:t xml:space="preserve">If this segment is a discussion</w:t>
-      </w:r>
-      <w:r>
-        <w:t xml:space="preserve">, the script is less about what you say and more about what you do with what they say. Four moves worth writing down in advance:</w:t>
+        <w:t xml:space="preserve">“[Verbatim bridge into the next segment.]”</w:t>
+      </w:r>
+    </w:p>
+    <w:bookmarkEnd w:id="67"/>
+    <w:bookmarkStart w:id="68" w:name="instructor-notes"/>
+    <w:p>
+      <w:pPr>
+        <w:pStyle w:val="Heading2"/>
+      </w:pPr>
+      <w:r>
+        <w:t xml:space="preserve">Instructor notes</w:t>
       </w:r>
     </w:p>
     <w:p>
@@ -5557,13 +7257,13 @@
           <w:b/>
           <w:bCs/>
         </w:rPr>
-        <w:t xml:space="preserve">Harvest in their words.</w:t>
-      </w:r>
-      <w:r>
-        <w:t xml:space="preserve"> </w:t>
-      </w:r>
-      <w:r>
-        <w:t xml:space="preserve">Write answers on the board as they said them, not as you’d have phrased them. Rewording on the spot tells the room their version was wrong.</w:t>
+        <w:t xml:space="preserve">If running long:</w:t>
+      </w:r>
+      <w:r>
+        <w:t xml:space="preserve"> </w:t>
+      </w:r>
+      <w:r>
+        <w:t xml:space="preserve">[what to cut]</w:t>
       </w:r>
     </w:p>
     <w:p>
@@ -5579,13 +7279,13 @@
           <w:b/>
           <w:bCs/>
         </w:rPr>
-        <w:t xml:space="preserve">Decide beforehand whether this segment converges.</w:t>
-      </w:r>
-      <w:r>
-        <w:t xml:space="preserve"> </w:t>
-      </w:r>
-      <w:r>
-        <w:t xml:space="preserve">Some discussions end in one answer; some end in a well-mapped disagreement. Both are fine — but you have to know which you’re running, or you’ll cut it off at the wrong moment.</w:t>
+        <w:t xml:space="preserve">If running short:</w:t>
+      </w:r>
+      <w:r>
+        <w:t xml:space="preserve"> </w:t>
+      </w:r>
+      <w:r>
+        <w:t xml:space="preserve">[what to add / expand]</w:t>
       </w:r>
     </w:p>
     <w:p>
@@ -5601,13 +7301,13 @@
           <w:b/>
           <w:bCs/>
         </w:rPr>
-        <w:t xml:space="preserve">Count ten seconds of silence.</w:t>
-      </w:r>
-      <w:r>
-        <w:t xml:space="preserve"> </w:t>
-      </w:r>
-      <w:r>
-        <w:t xml:space="preserve">It will feel like a minute. The second half of the wait is where the quieter people speak.</w:t>
+        <w:t xml:space="preserve">Energy:</w:t>
+      </w:r>
+      <w:r>
+        <w:t xml:space="preserve"> </w:t>
+      </w:r>
+      <w:r>
+        <w:t xml:space="preserve">[where to bring high energy, where to slow down]</w:t>
       </w:r>
     </w:p>
     <w:p>
@@ -5623,431 +7323,6 @@
           <w:b/>
           <w:bCs/>
         </w:rPr>
-        <w:t xml:space="preserve">For a plausible-but-wrong answer:</w:t>
-      </w:r>
-      <w:r>
-        <w:t xml:space="preserve"> </w:t>
-      </w:r>
-      <w:r>
-        <w:t xml:space="preserve">“say more about that”</w:t>
-      </w:r>
-      <w:r>
-        <w:t xml:space="preserve"> </w:t>
-      </w:r>
-      <w:r>
-        <w:t xml:space="preserve">— it surfaces the reasoning, which is the thing that actually needs correcting.</w:t>
-      </w:r>
-      <w:r>
-        <w:t xml:space="preserve"> </w:t>
-      </w:r>
-      <w:r>
-        <w:rPr>
-          <w:b/>
-          <w:bCs/>
-        </w:rPr>
-        <w:t xml:space="preserve">For the one loud voice:</w:t>
-      </w:r>
-      <w:r>
-        <w:t xml:space="preserve"> </w:t>
-      </w:r>
-      <w:r>
-        <w:t xml:space="preserve">“let’s hear two more before we judge.”</w:t>
-      </w:r>
-    </w:p>
-    <w:p>
-      <w:pPr>
-        <w:pStyle w:val="FirstParagraph"/>
-      </w:pPr>
-      <w:r>
-        <w:rPr>
-          <w:b/>
-          <w:bCs/>
-        </w:rPr>
-        <w:t xml:space="preserve">Teaching tips:</w:t>
-      </w:r>
-      <w:r>
-        <w:t xml:space="preserve"> </w:t>
-      </w:r>
-      <w:r>
-        <w:t xml:space="preserve">- …</w:t>
-      </w:r>
-      <w:r>
-        <w:t xml:space="preserve"> </w:t>
-      </w:r>
-      <w:r>
-        <w:t xml:space="preserve">- …</w:t>
-      </w:r>
-    </w:p>
-    <w:bookmarkEnd w:id="56"/>
-    <w:bookmarkStart w:id="57" w:name="x00y-next-sub-segment"/>
-    <w:p>
-      <w:pPr>
-        <w:pStyle w:val="Heading3"/>
-      </w:pPr>
-      <w:r>
-        <w:t xml:space="preserve">[0:0X–0:0Y] [next sub-segment]</w:t>
-      </w:r>
-    </w:p>
-    <w:p>
-      <w:pPr>
-        <w:pStyle w:val="BlockText"/>
-      </w:pPr>
-      <w:r>
-        <w:t xml:space="preserve">“…”</w:t>
-      </w:r>
-    </w:p>
-    <w:p>
-      <w:pPr>
-        <w:pStyle w:val="FirstParagraph"/>
-      </w:pPr>
-      <w:r>
-        <w:rPr>
-          <w:b/>
-          <w:bCs/>
-        </w:rPr>
-        <w:t xml:space="preserve">Teaching tips:</w:t>
-      </w:r>
-      <w:r>
-        <w:t xml:space="preserve"> </w:t>
-      </w:r>
-      <w:r>
-        <w:t xml:space="preserve">- …</w:t>
-      </w:r>
-    </w:p>
-    <w:p>
-      <w:pPr>
-        <w:pStyle w:val="BodyText"/>
-      </w:pPr>
-      <w:r>
-        <w:rPr>
-          <w:i/>
-          <w:iCs/>
-        </w:rPr>
-        <w:t xml:space="preserve">(Repeat one sub-block per chunk of the segment.)</w:t>
-      </w:r>
-    </w:p>
-    <w:bookmarkEnd w:id="57"/>
-    <w:bookmarkEnd w:id="58"/>
-    <w:bookmarkStart w:id="59" w:name="X1cc1e931be4cdd904d06a52a0e3917166f5a75d"/>
-    <w:p>
-      <w:pPr>
-        <w:pStyle w:val="Heading2"/>
-      </w:pPr>
-      <w:r>
-        <w:t xml:space="preserve">Engagement questions (instructor-posed; sprinkle through the segment)</w:t>
-      </w:r>
-    </w:p>
-    <w:p>
-      <w:pPr>
-        <w:pStyle w:val="FirstParagraph"/>
-      </w:pPr>
-      <w:r>
-        <w:rPr>
-          <w:i/>
-          <w:iCs/>
-        </w:rPr>
-        <w:t xml:space="preserve">1–2 heart-of-the-lesson probes — the intuition to grab, where people go wrong, or a</w:t>
-      </w:r>
-      <w:r>
-        <w:rPr>
-          <w:i/>
-          <w:iCs/>
-        </w:rPr>
-        <w:t xml:space="preserve"> </w:t>
-      </w:r>
-      <w:r>
-        <w:rPr>
-          <w:i/>
-          <w:iCs/>
-        </w:rPr>
-        <w:t xml:space="preserve">“why does this matter to you?”</w:t>
-      </w:r>
-      <w:r>
-        <w:rPr>
-          <w:i/>
-          <w:iCs/>
-        </w:rPr>
-        <w:t xml:space="preserve"> </w:t>
-      </w:r>
-      <w:r>
-        <w:rPr>
-          <w:i/>
-          <w:iCs/>
-        </w:rPr>
-        <w:t xml:space="preserve">hook. Mark each with [WAIT for responses]. (Different from the student questions below — these are what YOU ask THEM.)</w:t>
-      </w:r>
-      <w:r>
-        <w:t xml:space="preserve"> </w:t>
-      </w:r>
-      <w:r>
-        <w:t xml:space="preserve">-</w:t>
-      </w:r>
-      <w:r>
-        <w:t xml:space="preserve"> </w:t>
-      </w:r>
-      <w:r>
-        <w:t xml:space="preserve">“…?”</w:t>
-      </w:r>
-      <w:r>
-        <w:t xml:space="preserve"> </w:t>
-      </w:r>
-      <w:r>
-        <w:t xml:space="preserve">[WAIT for responses]</w:t>
-      </w:r>
-    </w:p>
-    <w:bookmarkEnd w:id="59"/>
-    <w:bookmarkStart w:id="60" w:name="common-student-questions-with-answers"/>
-    <w:p>
-      <w:pPr>
-        <w:pStyle w:val="Heading2"/>
-      </w:pPr>
-      <w:r>
-        <w:t xml:space="preserve">Common student questions (with answers)</w:t>
-      </w:r>
-    </w:p>
-    <w:p>
-      <w:pPr>
-        <w:pStyle w:val="FirstParagraph"/>
-      </w:pPr>
-      <w:r>
-        <w:rPr>
-          <w:b/>
-          <w:bCs/>
-        </w:rPr>
-        <w:t xml:space="preserve">Q:</w:t>
-      </w:r>
-      <w:r>
-        <w:rPr>
-          <w:b/>
-          <w:bCs/>
-        </w:rPr>
-        <w:t xml:space="preserve"> </w:t>
-      </w:r>
-      <w:r>
-        <w:rPr>
-          <w:b/>
-          <w:bCs/>
-        </w:rPr>
-        <w:t xml:space="preserve">“…?”</w:t>
-      </w:r>
-      <w:r>
-        <w:t xml:space="preserve"> </w:t>
-      </w:r>
-      <w:r>
-        <w:rPr>
-          <w:b/>
-          <w:bCs/>
-        </w:rPr>
-        <w:t xml:space="preserve">A:</w:t>
-      </w:r>
-      <w:r>
-        <w:t xml:space="preserve"> </w:t>
-      </w:r>
-      <w:r>
-        <w:t xml:space="preserve">“…”</w:t>
-      </w:r>
-    </w:p>
-    <w:p>
-      <w:pPr>
-        <w:pStyle w:val="BodyText"/>
-      </w:pPr>
-      <w:r>
-        <w:rPr>
-          <w:b/>
-          <w:bCs/>
-        </w:rPr>
-        <w:t xml:space="preserve">Q:</w:t>
-      </w:r>
-      <w:r>
-        <w:rPr>
-          <w:b/>
-          <w:bCs/>
-        </w:rPr>
-        <w:t xml:space="preserve"> </w:t>
-      </w:r>
-      <w:r>
-        <w:rPr>
-          <w:b/>
-          <w:bCs/>
-        </w:rPr>
-        <w:t xml:space="preserve">“…?”</w:t>
-      </w:r>
-      <w:r>
-        <w:t xml:space="preserve"> </w:t>
-      </w:r>
-      <w:r>
-        <w:rPr>
-          <w:b/>
-          <w:bCs/>
-        </w:rPr>
-        <w:t xml:space="preserve">A:</w:t>
-      </w:r>
-      <w:r>
-        <w:t xml:space="preserve"> </w:t>
-      </w:r>
-      <w:r>
-        <w:t xml:space="preserve">“…”</w:t>
-      </w:r>
-    </w:p>
-    <w:bookmarkEnd w:id="60"/>
-    <w:bookmarkStart w:id="61" w:name="segment-checklist"/>
-    <w:p>
-      <w:pPr>
-        <w:pStyle w:val="Heading2"/>
-      </w:pPr>
-      <w:r>
-        <w:t xml:space="preserve">Segment checklist</w:t>
-      </w:r>
-    </w:p>
-    <w:p>
-      <w:pPr>
-        <w:pStyle w:val="FirstParagraph"/>
-      </w:pPr>
-      <w:r>
-        <w:t xml:space="preserve">Before moving on, ensure:</w:t>
-      </w:r>
-      <w:r>
-        <w:t xml:space="preserve"> </w:t>
-      </w:r>
-      <w:r>
-        <w:t xml:space="preserve">- [ ] …</w:t>
-      </w:r>
-      <w:r>
-        <w:t xml:space="preserve"> </w:t>
-      </w:r>
-      <w:r>
-        <w:t xml:space="preserve">- [ ]</w:t>
-      </w:r>
-      <w:r>
-        <w:t xml:space="preserve"> </w:t>
-      </w:r>
-      <w:r>
-        <w:rPr>
-          <w:b/>
-          <w:bCs/>
-        </w:rPr>
-        <w:t xml:space="preserve">You’re at [time]</w:t>
-      </w:r>
-      <w:r>
-        <w:t xml:space="preserve"> </w:t>
-      </w:r>
-      <w:r>
-        <w:t xml:space="preserve">(timing checkpoint)</w:t>
-      </w:r>
-      <w:r>
-        <w:t xml:space="preserve"> </w:t>
-      </w:r>
-      <w:r>
-        <w:t xml:space="preserve">- [ ] Transition to the next segment is ready</w:t>
-      </w:r>
-    </w:p>
-    <w:bookmarkEnd w:id="61"/>
-    <w:bookmarkStart w:id="62" w:name="transition-to-next-segment"/>
-    <w:p>
-      <w:pPr>
-        <w:pStyle w:val="Heading2"/>
-      </w:pPr>
-      <w:r>
-        <w:t xml:space="preserve">Transition to next segment</w:t>
-      </w:r>
-    </w:p>
-    <w:p>
-      <w:pPr>
-        <w:pStyle w:val="BlockText"/>
-      </w:pPr>
-      <w:r>
-        <w:t xml:space="preserve">“[Verbatim bridge into the next segment.]”</w:t>
-      </w:r>
-    </w:p>
-    <w:bookmarkEnd w:id="62"/>
-    <w:bookmarkStart w:id="63" w:name="instructor-notes"/>
-    <w:p>
-      <w:pPr>
-        <w:pStyle w:val="Heading2"/>
-      </w:pPr>
-      <w:r>
-        <w:t xml:space="preserve">Instructor notes</w:t>
-      </w:r>
-    </w:p>
-    <w:p>
-      <w:pPr>
-        <w:pStyle w:val="Compact"/>
-        <w:numPr>
-          <w:ilvl w:val="0"/>
-          <w:numId w:val="1013"/>
-        </w:numPr>
-      </w:pPr>
-      <w:r>
-        <w:rPr>
-          <w:b/>
-          <w:bCs/>
-        </w:rPr>
-        <w:t xml:space="preserve">If running long:</w:t>
-      </w:r>
-      <w:r>
-        <w:t xml:space="preserve"> </w:t>
-      </w:r>
-      <w:r>
-        <w:t xml:space="preserve">[what to cut]</w:t>
-      </w:r>
-    </w:p>
-    <w:p>
-      <w:pPr>
-        <w:pStyle w:val="Compact"/>
-        <w:numPr>
-          <w:ilvl w:val="0"/>
-          <w:numId w:val="1013"/>
-        </w:numPr>
-      </w:pPr>
-      <w:r>
-        <w:rPr>
-          <w:b/>
-          <w:bCs/>
-        </w:rPr>
-        <w:t xml:space="preserve">If running short:</w:t>
-      </w:r>
-      <w:r>
-        <w:t xml:space="preserve"> </w:t>
-      </w:r>
-      <w:r>
-        <w:t xml:space="preserve">[what to add / expand]</w:t>
-      </w:r>
-    </w:p>
-    <w:p>
-      <w:pPr>
-        <w:pStyle w:val="Compact"/>
-        <w:numPr>
-          <w:ilvl w:val="0"/>
-          <w:numId w:val="1013"/>
-        </w:numPr>
-      </w:pPr>
-      <w:r>
-        <w:rPr>
-          <w:b/>
-          <w:bCs/>
-        </w:rPr>
-        <w:t xml:space="preserve">Energy:</w:t>
-      </w:r>
-      <w:r>
-        <w:t xml:space="preserve"> </w:t>
-      </w:r>
-      <w:r>
-        <w:t xml:space="preserve">[where to bring high energy, where to slow down]</w:t>
-      </w:r>
-    </w:p>
-    <w:p>
-      <w:pPr>
-        <w:pStyle w:val="Compact"/>
-        <w:numPr>
-          <w:ilvl w:val="0"/>
-          <w:numId w:val="1013"/>
-        </w:numPr>
-      </w:pPr>
-      <w:r>
-        <w:rPr>
-          <w:b/>
-          <w:bCs/>
-        </w:rPr>
         <w:t xml:space="preserve">Common pitfalls:</w:t>
       </w:r>
       <w:r>
@@ -6062,9 +7337,9 @@
         <w:br w:type="page"/>
       </w:r>
     </w:p>
-    <w:bookmarkEnd w:id="63"/>
-    <w:bookmarkEnd w:id="64"/>
-    <w:bookmarkStart w:id="66" w:name="week-4-ai-direction-verification-log"/>
+    <w:bookmarkEnd w:id="68"/>
+    <w:bookmarkEnd w:id="69"/>
+    <w:bookmarkStart w:id="71" w:name="week-4-ai-direction-verification-log"/>
     <w:p>
       <w:pPr>
         <w:pStyle w:val="Heading1"/>
@@ -6073,7 +7348,7 @@
         <w:t xml:space="preserve">Week 4 — AI-Direction + Verification Log</w:t>
       </w:r>
     </w:p>
-    <w:bookmarkStart w:id="65" w:name="ai-direction-verification-log"/>
+    <w:bookmarkStart w:id="70" w:name="ai-direction-verification-log"/>
     <w:p>
       <w:pPr>
         <w:pStyle w:val="Heading2"/>
@@ -6868,9 +8143,9 @@
         <w:br w:type="page"/>
       </w:r>
     </w:p>
-    <w:bookmarkEnd w:id="65"/>
-    <w:bookmarkEnd w:id="66"/>
-    <w:bookmarkStart w:id="70" w:name="week-4-worksheet-catch-the-ai-mistakes"/>
+    <w:bookmarkEnd w:id="70"/>
+    <w:bookmarkEnd w:id="71"/>
+    <w:bookmarkStart w:id="75" w:name="week-4-worksheet-catch-the-ai-mistakes"/>
     <w:p>
       <w:pPr>
         <w:pStyle w:val="Heading1"/>
@@ -6879,7 +8154,7 @@
         <w:t xml:space="preserve">Week 4 — Worksheet: Catch the AI mistakes</w:t>
       </w:r>
     </w:p>
-    <w:bookmarkStart w:id="67" w:name="Xf70175c30159e0145c0eb35e618d2d7ed35d6ce"/>
+    <w:bookmarkStart w:id="72" w:name="Xf70175c30159e0145c0eb35e618d2d7ed35d6ce"/>
     <w:p>
       <w:pPr>
         <w:pStyle w:val="Heading2"/>
@@ -6967,8 +8242,8 @@
         </w:pict>
       </w:r>
     </w:p>
-    <w:bookmarkEnd w:id="67"/>
-    <w:bookmarkStart w:id="68" w:name="X10a52587d1c3394dbd20fceaf3dfd48a0e9a173"/>
+    <w:bookmarkEnd w:id="72"/>
+    <w:bookmarkStart w:id="73" w:name="X10a52587d1c3394dbd20fceaf3dfd48a0e9a173"/>
     <w:p>
       <w:pPr>
         <w:pStyle w:val="Heading2"/>
@@ -7090,8 +8365,8 @@
         </w:pict>
       </w:r>
     </w:p>
-    <w:bookmarkEnd w:id="68"/>
-    <w:bookmarkStart w:id="69" w:name="find-the-problems"/>
+    <w:bookmarkEnd w:id="73"/>
+    <w:bookmarkStart w:id="74" w:name="find-the-problems"/>
     <w:p>
       <w:pPr>
         <w:pStyle w:val="Heading2"/>
@@ -7162,9 +8437,9 @@
         <w:br w:type="page"/>
       </w:r>
     </w:p>
-    <w:bookmarkEnd w:id="69"/>
-    <w:bookmarkEnd w:id="70"/>
-    <w:bookmarkStart w:id="78" w:name="week-4-worksheet-catch-the-agents-report"/>
+    <w:bookmarkEnd w:id="74"/>
+    <w:bookmarkEnd w:id="75"/>
+    <w:bookmarkStart w:id="83" w:name="week-4-worksheet-catch-the-agents-report"/>
     <w:p>
       <w:pPr>
         <w:pStyle w:val="Heading1"/>
@@ -7173,7 +8448,7 @@
         <w:t xml:space="preserve">Week 4 — Worksheet: Catch the agent’s report</w:t>
       </w:r>
     </w:p>
-    <w:bookmarkStart w:id="71" w:name="X046bc0f55e131b3e4db12f5b24bdc843a9e2c7f"/>
+    <w:bookmarkStart w:id="76" w:name="X046bc0f55e131b3e4db12f5b24bdc843a9e2c7f"/>
     <w:p>
       <w:pPr>
         <w:pStyle w:val="Heading2"/>
@@ -7284,8 +8559,8 @@
         </w:pict>
       </w:r>
     </w:p>
-    <w:bookmarkEnd w:id="71"/>
-    <w:bookmarkStart w:id="72" w:name="X7a5433d17ecb165090b8b6c4aefb6845978bae0"/>
+    <w:bookmarkEnd w:id="76"/>
+    <w:bookmarkStart w:id="77" w:name="X7a5433d17ecb165090b8b6c4aefb6845978bae0"/>
     <w:p>
       <w:pPr>
         <w:pStyle w:val="Heading2"/>
@@ -7930,8 +9205,8 @@
         </w:tc>
       </w:tr>
     </w:tbl>
-    <w:bookmarkEnd w:id="72"/>
-    <w:bookmarkStart w:id="73" w:name="the-agents-report"/>
+    <w:bookmarkEnd w:id="77"/>
+    <w:bookmarkStart w:id="78" w:name="the-agents-report"/>
     <w:p>
       <w:pPr>
         <w:pStyle w:val="Heading2"/>
@@ -8064,8 +9339,8 @@
         <w:t xml:space="preserve">Could not verify: none.</w:t>
       </w:r>
     </w:p>
-    <w:bookmarkEnd w:id="73"/>
-    <w:bookmarkStart w:id="74" w:name="file-1-complete_solution-excerpt"/>
+    <w:bookmarkEnd w:id="78"/>
+    <w:bookmarkStart w:id="79" w:name="file-1-complete_solution-excerpt"/>
     <w:p>
       <w:pPr>
         <w:pStyle w:val="Heading2"/>
@@ -8412,8 +9687,8 @@
         <w:t xml:space="preserve">## expected: 5 bars</w:t>
       </w:r>
     </w:p>
-    <w:bookmarkEnd w:id="74"/>
-    <w:bookmarkStart w:id="75" w:name="X2c02df4d945a767b33b76c99d25d5028970fc05"/>
+    <w:bookmarkEnd w:id="79"/>
+    <w:bookmarkStart w:id="80" w:name="X2c02df4d945a767b33b76c99d25d5028970fc05"/>
     <w:p>
       <w:pPr>
         <w:pStyle w:val="Heading2"/>
@@ -8826,8 +10101,8 @@
         <w:t xml:space="preserve">## Hint: close what you opened.</w:t>
       </w:r>
     </w:p>
-    <w:bookmarkEnd w:id="75"/>
-    <w:bookmarkStart w:id="76" w:name="file-3-post_classpractice-excerpt"/>
+    <w:bookmarkEnd w:id="80"/>
+    <w:bookmarkStart w:id="81" w:name="file-3-post_classpractice-excerpt"/>
     <w:p>
       <w:pPr>
         <w:pStyle w:val="Heading2"/>
@@ -8899,8 +10174,8 @@
         </w:pict>
       </w:r>
     </w:p>
-    <w:bookmarkEnd w:id="76"/>
-    <w:bookmarkStart w:id="77" w:name="grade-the-report"/>
+    <w:bookmarkEnd w:id="81"/>
+    <w:bookmarkStart w:id="82" w:name="grade-the-report"/>
     <w:p>
       <w:pPr>
         <w:pStyle w:val="Heading2"/>
@@ -8945,7 +10220,7 @@
         <w:pStyle w:val="Compact"/>
         <w:numPr>
           <w:ilvl w:val="0"/>
-          <w:numId w:val="1014"/>
+          <w:numId w:val="1013"/>
         </w:numPr>
       </w:pPr>
       <w:r>
@@ -8963,7 +10238,7 @@
         <w:pStyle w:val="Compact"/>
         <w:numPr>
           <w:ilvl w:val="0"/>
-          <w:numId w:val="1014"/>
+          <w:numId w:val="1013"/>
         </w:numPr>
       </w:pPr>
       <w:r>
@@ -8981,7 +10256,7 @@
         <w:pStyle w:val="Compact"/>
         <w:numPr>
           <w:ilvl w:val="0"/>
-          <w:numId w:val="1014"/>
+          <w:numId w:val="1013"/>
         </w:numPr>
       </w:pPr>
       <w:r>
@@ -8999,7 +10274,7 @@
         <w:pStyle w:val="Compact"/>
         <w:numPr>
           <w:ilvl w:val="0"/>
-          <w:numId w:val="1014"/>
+          <w:numId w:val="1013"/>
         </w:numPr>
       </w:pPr>
       <w:r>
@@ -9017,7 +10292,7 @@
         <w:pStyle w:val="Compact"/>
         <w:numPr>
           <w:ilvl w:val="0"/>
-          <w:numId w:val="1014"/>
+          <w:numId w:val="1013"/>
         </w:numPr>
       </w:pPr>
       <w:r>
@@ -9252,8 +10527,340 @@
         <w:t xml:space="preserve">the report is not the verification.</w:t>
       </w:r>
     </w:p>
-    <w:bookmarkEnd w:id="77"/>
-    <w:bookmarkEnd w:id="78"/>
+    <w:p>
+      <w:r>
+        <w:br w:type="page"/>
+      </w:r>
+    </w:p>
+    <w:bookmarkEnd w:id="82"/>
+    <w:bookmarkEnd w:id="83"/>
+    <w:bookmarkStart w:id="84" w:name="Xd44bb9996c29a87590f6c25553de9b27481fa27"/>
+    <w:p>
+      <w:pPr>
+        <w:pStyle w:val="Heading1"/>
+      </w:pPr>
+      <w:r>
+        <w:t xml:space="preserve">Week 4 — Optional: a module’s page (introduction · materials · assignment · conclusion)</w:t>
+      </w:r>
+    </w:p>
+    <w:p>
+      <w:pPr>
+        <w:pStyle w:val="FirstParagraph"/>
+      </w:pPr>
+      <w:r>
+        <w:t xml:space="preserve">Module Build Template</w:t>
+      </w:r>
+    </w:p>
+    <w:p>
+      <w:pPr>
+        <w:pStyle w:val="BodyText"/>
+      </w:pPr>
+      <w:r>
+        <w:t xml:space="preserve">Each item below represents various module pages</w:t>
+      </w:r>
+    </w:p>
+    <w:p>
+      <w:pPr>
+        <w:pStyle w:val="BodyText"/>
+      </w:pPr>
+      <w:r>
+        <w:rPr>
+          <w:b/>
+          <w:bCs/>
+        </w:rPr>
+        <w:t xml:space="preserve">Module Number &amp; Title:</w:t>
+      </w:r>
+    </w:p>
+    <w:p>
+      <w:pPr>
+        <w:pStyle w:val="BodyText"/>
+      </w:pPr>
+      <w:r>
+        <w:rPr>
+          <w:b/>
+          <w:bCs/>
+        </w:rPr>
+        <w:t xml:space="preserve">Module Introduction Paragraphs</w:t>
+      </w:r>
+      <w:r>
+        <w:t xml:space="preserve">:</w:t>
+      </w:r>
+      <w:r>
+        <w:t xml:space="preserve"> </w:t>
+      </w:r>
+      <w:r>
+        <w:rPr>
+          <w:i/>
+          <w:iCs/>
+        </w:rPr>
+        <w:t xml:space="preserve">[Enter module introduction here of approximately 2-4 paragraphs. The purpose of this paragraph is to help frame the instruction in the module so that students can learn it more easily. Try to use this paragraph to gain the learner’s attention. Using an anecdote or real-world example demonstrating the value of course content can work well. Also, remind students of material that has been covered in previous modules or in previous courses that will be expanded on in this module. Finally, explain to students why the material in this module may be important to them as future professionals in the field. Using references and citations can help demonstrate good academic behavior and is encouraged.]</w:t>
+      </w:r>
+    </w:p>
+    <w:p>
+      <w:pPr>
+        <w:pStyle w:val="SourceCode"/>
+      </w:pPr>
+      <w:r>
+        <w:rPr>
+          <w:rStyle w:val="VerbatimChar"/>
+        </w:rPr>
+        <w:t xml:space="preserve">        Enter here…</w:t>
+      </w:r>
+    </w:p>
+    <w:p>
+      <w:pPr>
+        <w:numPr>
+          <w:ilvl w:val="0"/>
+          <w:numId w:val="1014"/>
+        </w:numPr>
+      </w:pPr>
+      <w:r>
+        <w:rPr>
+          <w:b/>
+          <w:bCs/>
+        </w:rPr>
+        <w:t xml:space="preserve">Materials</w:t>
+      </w:r>
+      <w:r>
+        <w:t xml:space="preserve">:</w:t>
+      </w:r>
+      <w:r>
+        <w:t xml:space="preserve"> </w:t>
+      </w:r>
+      <w:r>
+        <w:rPr>
+          <w:i/>
+          <w:iCs/>
+        </w:rPr>
+        <w:t xml:space="preserve">[In order of priority, list the readings and videos that students will read and watch in this module. Please include a web link to any materials that are on the internet or a pdf document for those that you have copies of. If the material is something that we created, just list the name of it.]</w:t>
+      </w:r>
+      <w:r>
+        <w:br/>
+      </w:r>
+      <w:r>
+        <w:t xml:space="preserve">Enter here…</w:t>
+      </w:r>
+      <w:r>
+        <w:br/>
+      </w:r>
+    </w:p>
+    <w:p>
+      <w:pPr>
+        <w:numPr>
+          <w:ilvl w:val="0"/>
+          <w:numId w:val="1014"/>
+        </w:numPr>
+      </w:pPr>
+      <w:r>
+        <w:rPr>
+          <w:b/>
+          <w:bCs/>
+        </w:rPr>
+        <w:t xml:space="preserve">Discussion Assignment Prompts:</w:t>
+      </w:r>
+      <w:r>
+        <w:t xml:space="preserve"> </w:t>
+      </w:r>
+      <w:r>
+        <w:rPr>
+          <w:i/>
+          <w:iCs/>
+        </w:rPr>
+        <w:t xml:space="preserve">[Write the discussion assignment prompt for this module below. Please separate the prompts if there is more than 1 discussion assignment in this module.]</w:t>
+      </w:r>
+      <w:r>
+        <w:br/>
+      </w:r>
+      <w:r>
+        <w:t xml:space="preserve">Enter here…</w:t>
+      </w:r>
+      <w:r>
+        <w:br/>
+      </w:r>
+    </w:p>
+    <w:p>
+      <w:pPr>
+        <w:numPr>
+          <w:ilvl w:val="0"/>
+          <w:numId w:val="1014"/>
+        </w:numPr>
+      </w:pPr>
+      <w:r>
+        <w:rPr>
+          <w:b/>
+          <w:bCs/>
+        </w:rPr>
+        <w:t xml:space="preserve">Module Assignment/Assessment:</w:t>
+      </w:r>
+      <w:r>
+        <w:t xml:space="preserve"> </w:t>
+      </w:r>
+      <w:r>
+        <w:rPr>
+          <w:i/>
+          <w:iCs/>
+        </w:rPr>
+        <w:t xml:space="preserve">[If there are assignments in this module such as a module learning activity or paper, write the instructions below. Please copy and paste as necessary if there is more than 1. Include the following information in the prompt:</w:t>
+      </w:r>
+      <w:r>
+        <w:br/>
+      </w:r>
+      <w:r>
+        <w:rPr>
+          <w:i/>
+          <w:iCs/>
+        </w:rPr>
+        <w:t xml:space="preserve">Purpose - Why are students completing this assignment? Which module and course learning objectives is it related to? Are there any readings or other materials related to this assignment? If so, please list/identify them</w:t>
+      </w:r>
+      <w:r>
+        <w:br/>
+      </w:r>
+      <w:r>
+        <w:rPr>
+          <w:i/>
+          <w:iCs/>
+        </w:rPr>
+        <w:t xml:space="preserve">Directions - What are students doing and submitting here? Identify and explain everything students need to include in their submission here and how much of it they need as well.</w:t>
+      </w:r>
+      <w:r>
+        <w:br/>
+      </w:r>
+      <w:r>
+        <w:rPr>
+          <w:i/>
+          <w:iCs/>
+        </w:rPr>
+        <w:t xml:space="preserve">Feedback &amp; completion - How will students know they’ve done this well, and what feedback will they get? What marks it complete? (This method uses</w:t>
+      </w:r>
+      <w:r>
+        <w:rPr>
+          <w:i/>
+          <w:iCs/>
+        </w:rPr>
+        <w:t xml:space="preserve"> </w:t>
+      </w:r>
+      <w:r>
+        <w:rPr>
+          <w:b/>
+          <w:bCs/>
+          <w:i/>
+          <w:iCs/>
+        </w:rPr>
+        <w:t xml:space="preserve">completion + feedback, not grades</w:t>
+      </w:r>
+      <w:r>
+        <w:rPr>
+          <w:i/>
+          <w:iCs/>
+        </w:rPr>
+        <w:t xml:space="preserve"> </w:t>
+      </w:r>
+      <w:r>
+        <w:rPr>
+          <w:i/>
+          <w:iCs/>
+        </w:rPr>
+        <w:t xml:space="preserve">— describe the feedback and the bar for</w:t>
+      </w:r>
+      <w:r>
+        <w:rPr>
+          <w:i/>
+          <w:iCs/>
+        </w:rPr>
+        <w:t xml:space="preserve"> </w:t>
+      </w:r>
+      <w:r>
+        <w:rPr>
+          <w:i/>
+          <w:iCs/>
+        </w:rPr>
+        <w:t xml:space="preserve">“done,”</w:t>
+      </w:r>
+      <w:r>
+        <w:rPr>
+          <w:i/>
+          <w:iCs/>
+        </w:rPr>
+        <w:t xml:space="preserve"> </w:t>
+      </w:r>
+      <w:r>
+        <w:rPr>
+          <w:i/>
+          <w:iCs/>
+        </w:rPr>
+        <w:t xml:space="preserve">not a score or grade weight.)</w:t>
+      </w:r>
+      <w:r>
+        <w:br/>
+      </w:r>
+      <w:r>
+        <w:rPr>
+          <w:i/>
+          <w:iCs/>
+        </w:rPr>
+        <w:t xml:space="preserve">Attach a checklist or feedback rubric if you’ll use one — given to the learner as feedback, not as a score.</w:t>
+      </w:r>
+      <w:r>
+        <w:br/>
+      </w:r>
+      <w:r>
+        <w:rPr>
+          <w:i/>
+          <w:iCs/>
+        </w:rPr>
+        <w:t xml:space="preserve">Please include any other information that you think is necessary.]</w:t>
+      </w:r>
+      <w:r>
+        <w:br/>
+      </w:r>
+      <w:r>
+        <w:t xml:space="preserve">Enter here…</w:t>
+      </w:r>
+      <w:r>
+        <w:br/>
+      </w:r>
+    </w:p>
+    <w:p>
+      <w:pPr>
+        <w:numPr>
+          <w:ilvl w:val="0"/>
+          <w:numId w:val="1014"/>
+        </w:numPr>
+      </w:pPr>
+      <w:r>
+        <w:rPr>
+          <w:b/>
+          <w:bCs/>
+        </w:rPr>
+        <w:t xml:space="preserve">Module Conclusion:</w:t>
+      </w:r>
+      <w:r>
+        <w:t xml:space="preserve"> </w:t>
+      </w:r>
+      <w:r>
+        <w:rPr>
+          <w:i/>
+          <w:iCs/>
+        </w:rPr>
+        <w:t xml:space="preserve">[Enter module conclusion information. A paragraph wrapping up the module and pivoting towards the next module is sufficient.]</w:t>
+      </w:r>
+    </w:p>
+    <w:p>
+      <w:pPr>
+        <w:pStyle w:val="SourceCode"/>
+        <w:numPr>
+          <w:ilvl w:val="0"/>
+          <w:numId w:val="1000"/>
+        </w:numPr>
+      </w:pPr>
+      <w:r>
+        <w:rPr>
+          <w:rStyle w:val="VerbatimChar"/>
+        </w:rPr>
+        <w:t xml:space="preserve">     Enter here...</w:t>
+      </w:r>
+    </w:p>
+    <w:bookmarkEnd w:id="84"/>
     <w:sectPr>
       <w:footnotePr>
         <w:numRestart w:val="eachSect"/>
@@ -9637,6 +11244,82 @@
       </w:pPr>
     </w:lvl>
   </w:abstractNum>
+  <w:abstractNum w:abstractNumId="992">
+    <w:nsid w:val="0000A992"/>
+    <w:multiLevelType w:val="multilevel"/>
+    <w:lvl w:ilvl="0">
+      <w:numFmt w:val="bullet"/>
+      <w:lvlText w:val="☐"/>
+      <w:lvlJc w:val="left"/>
+      <w:pPr>
+        <w:ind w:left="720" w:hanging="360"/>
+      </w:pPr>
+    </w:lvl>
+    <w:lvl w:ilvl="1">
+      <w:numFmt w:val="bullet"/>
+      <w:lvlText w:val="☐"/>
+      <w:lvlJc w:val="left"/>
+      <w:pPr>
+        <w:ind w:left="1440" w:hanging="360"/>
+      </w:pPr>
+    </w:lvl>
+    <w:lvl w:ilvl="2">
+      <w:numFmt w:val="bullet"/>
+      <w:lvlText w:val="☐"/>
+      <w:lvlJc w:val="left"/>
+      <w:pPr>
+        <w:ind w:left="2160" w:hanging="360"/>
+      </w:pPr>
+    </w:lvl>
+    <w:lvl w:ilvl="3">
+      <w:numFmt w:val="bullet"/>
+      <w:lvlText w:val="☐"/>
+      <w:lvlJc w:val="left"/>
+      <w:pPr>
+        <w:ind w:left="2880" w:hanging="360"/>
+      </w:pPr>
+    </w:lvl>
+    <w:lvl w:ilvl="4">
+      <w:numFmt w:val="bullet"/>
+      <w:lvlText w:val="☐"/>
+      <w:lvlJc w:val="left"/>
+      <w:pPr>
+        <w:ind w:left="3600" w:hanging="360"/>
+      </w:pPr>
+    </w:lvl>
+    <w:lvl w:ilvl="5">
+      <w:numFmt w:val="bullet"/>
+      <w:lvlText w:val="☐"/>
+      <w:lvlJc w:val="left"/>
+      <w:pPr>
+        <w:ind w:left="4320" w:hanging="360"/>
+      </w:pPr>
+    </w:lvl>
+    <w:lvl w:ilvl="6">
+      <w:numFmt w:val="bullet"/>
+      <w:lvlText w:val="☐"/>
+      <w:lvlJc w:val="left"/>
+      <w:pPr>
+        <w:ind w:left="5040" w:hanging="360"/>
+      </w:pPr>
+    </w:lvl>
+    <w:lvl w:ilvl="7">
+      <w:numFmt w:val="bullet"/>
+      <w:lvlText w:val="☐"/>
+      <w:lvlJc w:val="left"/>
+      <w:pPr>
+        <w:ind w:left="5760" w:hanging="360"/>
+      </w:pPr>
+    </w:lvl>
+    <w:lvl w:ilvl="8">
+      <w:numFmt w:val="bullet"/>
+      <w:lvlText w:val="☐"/>
+      <w:lvlJc w:val="left"/>
+      <w:pPr>
+        <w:ind w:left="6480" w:hanging="360"/>
+      </w:pPr>
+    </w:lvl>
+  </w:abstractNum>
   <w:abstractNum w:abstractNumId="99412">
     <w:nsid w:val="00A99412"/>
     <w:multiLevelType w:val="multilevel"/>
@@ -9716,82 +11399,6 @@
       <w:start w:val="2"/>
       <w:numFmt w:val="decimal"/>
       <w:lvlText w:val="%9."/>
-      <w:lvlJc w:val="left"/>
-      <w:pPr>
-        <w:ind w:left="6480" w:hanging="360"/>
-      </w:pPr>
-    </w:lvl>
-  </w:abstractNum>
-  <w:abstractNum w:abstractNumId="992">
-    <w:nsid w:val="0000A992"/>
-    <w:multiLevelType w:val="multilevel"/>
-    <w:lvl w:ilvl="0">
-      <w:numFmt w:val="bullet"/>
-      <w:lvlText w:val="☐"/>
-      <w:lvlJc w:val="left"/>
-      <w:pPr>
-        <w:ind w:left="720" w:hanging="360"/>
-      </w:pPr>
-    </w:lvl>
-    <w:lvl w:ilvl="1">
-      <w:numFmt w:val="bullet"/>
-      <w:lvlText w:val="☐"/>
-      <w:lvlJc w:val="left"/>
-      <w:pPr>
-        <w:ind w:left="1440" w:hanging="360"/>
-      </w:pPr>
-    </w:lvl>
-    <w:lvl w:ilvl="2">
-      <w:numFmt w:val="bullet"/>
-      <w:lvlText w:val="☐"/>
-      <w:lvlJc w:val="left"/>
-      <w:pPr>
-        <w:ind w:left="2160" w:hanging="360"/>
-      </w:pPr>
-    </w:lvl>
-    <w:lvl w:ilvl="3">
-      <w:numFmt w:val="bullet"/>
-      <w:lvlText w:val="☐"/>
-      <w:lvlJc w:val="left"/>
-      <w:pPr>
-        <w:ind w:left="2880" w:hanging="360"/>
-      </w:pPr>
-    </w:lvl>
-    <w:lvl w:ilvl="4">
-      <w:numFmt w:val="bullet"/>
-      <w:lvlText w:val="☐"/>
-      <w:lvlJc w:val="left"/>
-      <w:pPr>
-        <w:ind w:left="3600" w:hanging="360"/>
-      </w:pPr>
-    </w:lvl>
-    <w:lvl w:ilvl="5">
-      <w:numFmt w:val="bullet"/>
-      <w:lvlText w:val="☐"/>
-      <w:lvlJc w:val="left"/>
-      <w:pPr>
-        <w:ind w:left="4320" w:hanging="360"/>
-      </w:pPr>
-    </w:lvl>
-    <w:lvl w:ilvl="6">
-      <w:numFmt w:val="bullet"/>
-      <w:lvlText w:val="☐"/>
-      <w:lvlJc w:val="left"/>
-      <w:pPr>
-        <w:ind w:left="5040" w:hanging="360"/>
-      </w:pPr>
-    </w:lvl>
-    <w:lvl w:ilvl="7">
-      <w:numFmt w:val="bullet"/>
-      <w:lvlText w:val="☐"/>
-      <w:lvlJc w:val="left"/>
-      <w:pPr>
-        <w:ind w:left="5760" w:hanging="360"/>
-      </w:pPr>
-    </w:lvl>
-    <w:lvl w:ilvl="8">
-      <w:numFmt w:val="bullet"/>
-      <w:lvlText w:val="☐"/>
       <w:lvlJc w:val="left"/>
       <w:pPr>
         <w:ind w:left="6480" w:hanging="360"/>
@@ -9988,6 +11595,48 @@
     <w:abstractNumId w:val="991"/>
   </w:num>
   <w:num w:numId="1009">
+    <w:abstractNumId w:val="992"/>
+  </w:num>
+  <w:num w:numId="1010">
+    <w:abstractNumId w:val="992"/>
+  </w:num>
+  <w:num w:numId="1011">
+    <w:abstractNumId w:val="991"/>
+  </w:num>
+  <w:num w:numId="1012">
+    <w:abstractNumId w:val="991"/>
+  </w:num>
+  <w:num w:numId="1013">
+    <w:abstractNumId w:val="99411"/>
+    <w:lvlOverride w:ilvl="0">
+      <w:startOverride w:val="1"/>
+    </w:lvlOverride>
+    <w:lvlOverride w:ilvl="1">
+      <w:startOverride w:val="1"/>
+    </w:lvlOverride>
+    <w:lvlOverride w:ilvl="2">
+      <w:startOverride w:val="1"/>
+    </w:lvlOverride>
+    <w:lvlOverride w:ilvl="3">
+      <w:startOverride w:val="1"/>
+    </w:lvlOverride>
+    <w:lvlOverride w:ilvl="4">
+      <w:startOverride w:val="1"/>
+    </w:lvlOverride>
+    <w:lvlOverride w:ilvl="5">
+      <w:startOverride w:val="1"/>
+    </w:lvlOverride>
+    <w:lvlOverride w:ilvl="6">
+      <w:startOverride w:val="1"/>
+    </w:lvlOverride>
+    <w:lvlOverride w:ilvl="7">
+      <w:startOverride w:val="1"/>
+    </w:lvlOverride>
+    <w:lvlOverride w:ilvl="8">
+      <w:startOverride w:val="1"/>
+    </w:lvlOverride>
+  </w:num>
+  <w:num w:numId="1014">
     <w:abstractNumId w:val="99412"/>
     <w:lvlOverride w:ilvl="0">
       <w:startOverride w:val="2"/>
@@ -10015,48 +11664,6 @@
     </w:lvlOverride>
     <w:lvlOverride w:ilvl="8">
       <w:startOverride w:val="2"/>
-    </w:lvlOverride>
-  </w:num>
-  <w:num w:numId="1010">
-    <w:abstractNumId w:val="992"/>
-  </w:num>
-  <w:num w:numId="1011">
-    <w:abstractNumId w:val="992"/>
-  </w:num>
-  <w:num w:numId="1012">
-    <w:abstractNumId w:val="991"/>
-  </w:num>
-  <w:num w:numId="1013">
-    <w:abstractNumId w:val="991"/>
-  </w:num>
-  <w:num w:numId="1014">
-    <w:abstractNumId w:val="99411"/>
-    <w:lvlOverride w:ilvl="0">
-      <w:startOverride w:val="1"/>
-    </w:lvlOverride>
-    <w:lvlOverride w:ilvl="1">
-      <w:startOverride w:val="1"/>
-    </w:lvlOverride>
-    <w:lvlOverride w:ilvl="2">
-      <w:startOverride w:val="1"/>
-    </w:lvlOverride>
-    <w:lvlOverride w:ilvl="3">
-      <w:startOverride w:val="1"/>
-    </w:lvlOverride>
-    <w:lvlOverride w:ilvl="4">
-      <w:startOverride w:val="1"/>
-    </w:lvlOverride>
-    <w:lvlOverride w:ilvl="5">
-      <w:startOverride w:val="1"/>
-    </w:lvlOverride>
-    <w:lvlOverride w:ilvl="6">
-      <w:startOverride w:val="1"/>
-    </w:lvlOverride>
-    <w:lvlOverride w:ilvl="7">
-      <w:startOverride w:val="1"/>
-    </w:lvlOverride>
-    <w:lvlOverride w:ilvl="8">
-      <w:startOverride w:val="1"/>
     </w:lvlOverride>
   </w:num>
 </w:numbering>

</xml_diff>